<commit_message>
Update AquiferOpenBibleDictionary for 2026-08-03 release
</commit_message>
<xml_diff>
--- a/eng/docx/009.content.docx
+++ b/eng/docx/009.content.docx
@@ -745,7 +745,7 @@
         <w:rPr>
           <w:lang w:val="en_US" w:bidi="en_US"/>
         </w:rPr>
-        <w:t>Jeroham’s son from Benjamin’s tribe (</w:t>
+        <w:t>Ibneiah was Jeroham’s son from the tribe of Benjamin (</w:t>
       </w:r>
       <w:hyperlink r:id="rId24">
         <w:r>
@@ -756,7 +756,7 @@
             <w:color w:val="0000EE"/>
             <w:u w:val="single"/>
           </w:rPr>
-          <w:t>1 Chr 9:8</w:t>
+          <w:t>1 Chronicles 9:8</w:t>
         </w:r>
       </w:hyperlink>
       <w:r>
@@ -811,7 +811,7 @@
         <w:rPr>
           <w:lang w:val="en_US" w:bidi="en_US"/>
         </w:rPr>
-        <w:t>Forefather of Meshullam from Benjamin’s tribe (</w:t>
+        <w:t>Ibnijah was the ancestor of Meshullam from the tribe of Benjamin (</w:t>
       </w:r>
       <w:hyperlink r:id="rId24">
         <w:r>
@@ -822,7 +822,7 @@
             <w:color w:val="0000EE"/>
             <w:u w:val="single"/>
           </w:rPr>
-          <w:t>1 Chr 9:8</w:t>
+          <w:t>1 Chronicles 9:8</w:t>
         </w:r>
       </w:hyperlink>
       <w:r>
@@ -943,7 +943,7 @@
         <w:rPr>
           <w:lang w:val="en_US" w:bidi="en_US"/>
         </w:rPr>
-        <w:t>Tola’s son from Issachar’s tribe (</w:t>
+        <w:t>Ibsam was Tola’s son from the tribe of Issachar (</w:t>
       </w:r>
       <w:hyperlink r:id="rId26">
         <w:r>
@@ -954,7 +954,7 @@
             <w:color w:val="0000EE"/>
             <w:u w:val="single"/>
           </w:rPr>
-          <w:t>1 Chr 7:2</w:t>
+          <w:t>1 Chronicles 7:2</w:t>
         </w:r>
       </w:hyperlink>
       <w:r>
@@ -5162,6 +5162,20 @@
       </w:r>
       <w:r>
         <w:rPr>
+          <w:lang w:val="en_US" w:bidi="en_US"/>
+        </w:rPr>
+        <w:t>Illness is a condition of poor health or disease that affects the body or mind. The Bible describes many kinds of illness and records that God sometimes brought healing through prophets, Jesus, and the apostles.</w:t>
+      </w:r>
+    </w:p>
+    <w:p>
+      <w:pPr/>
+      <w:r>
+        <w:rPr>
+          <w:lang w:val="en_US" w:bidi="en_US"/>
+        </w:rPr>
+      </w:r>
+      <w:r>
+        <w:rPr>
           <w:i/>
           <w:lang w:val="en_US" w:bidi="en_US"/>
         </w:rPr>
@@ -5178,6 +5192,18 @@
           <w:lang w:val="en_US" w:bidi="en_US"/>
         </w:rPr>
         <w:t>Disease</w:t>
+      </w:r>
+      <w:r>
+        <w:rPr>
+          <w:lang w:val="en_US" w:bidi="en_US"/>
+        </w:rPr>
+        <w:t xml:space="preserve">; </w:t>
+      </w:r>
+      <w:r>
+        <w:rPr>
+          <w:lang w:val="en_US" w:bidi="en_US"/>
+        </w:rPr>
+        <w:t>Heal, Healing</w:t>
       </w:r>
       <w:r>
         <w:rPr>
@@ -7945,7 +7971,7 @@
         <w:rPr>
           <w:lang w:val="en_US" w:bidi="en_US"/>
         </w:rPr>
-        <w:t>Helem’s son from Asher’s tribe (</w:t>
+        <w:t>Imna was Helem’s son from the tribe of Asher (</w:t>
       </w:r>
       <w:hyperlink r:id="rId192">
         <w:r>
@@ -7956,7 +7982,7 @@
             <w:color w:val="0000EE"/>
             <w:u w:val="single"/>
           </w:rPr>
-          <w:t>1 Chr 7:35</w:t>
+          <w:t>1 Chronicles 7:35</w:t>
         </w:r>
       </w:hyperlink>
       <w:r>
@@ -10573,7 +10599,15 @@
         <w:rPr>
           <w:lang w:val="en_US" w:bidi="en_US"/>
         </w:rPr>
-        <w:t xml:space="preserve">Chant used in magic. </w:t>
+        <w:t xml:space="preserve">An incantation is a chant used in magic. </w:t>
+      </w:r>
+    </w:p>
+    <w:p>
+      <w:pPr/>
+      <w:r>
+        <w:rPr>
+          <w:lang w:val="en_US" w:bidi="en_US"/>
+        </w:rPr>
       </w:r>
       <w:r>
         <w:rPr>
@@ -14129,6 +14163,20 @@
         <w:rPr>
           <w:lang w:val="en_US" w:bidi="en_US"/>
         </w:rPr>
+      </w:r>
+    </w:p>
+    <w:p>
+      <w:pPr/>
+      <w:r>
+        <w:rPr>
+          <w:lang w:val="en_US" w:bidi="en_US"/>
+        </w:rPr>
+      </w:r>
+      <w:r>
+        <w:rPr>
+          <w:lang w:val="en_US" w:bidi="en_US"/>
+        </w:rPr>
+        <w:t>Infirmity is an older word for physical weakness, sickness, or disability. In some Bible passages, it may also describe human weakness more generally.</w:t>
       </w:r>
     </w:p>
     <w:p>
@@ -23350,7 +23398,7 @@
         <w:rPr>
           <w:lang w:val="en_US" w:bidi="en_US"/>
         </w:rPr>
-        <w:t>Shashak’s son from Benjamin’s tribe (</w:t>
+        <w:t>Iphdeiah was Shashak’s son from the tribe of Benjamin (</w:t>
       </w:r>
       <w:hyperlink r:id="rId617">
         <w:r>
@@ -23361,7 +23409,7 @@
             <w:color w:val="0000EE"/>
             <w:u w:val="single"/>
           </w:rPr>
-          <w:t>1 Chr 8:25</w:t>
+          <w:t>1 Chronicles 8:25</w:t>
         </w:r>
       </w:hyperlink>
       <w:r>
@@ -24000,7 +24048,7 @@
         <w:rPr>
           <w:lang w:val="en_US" w:bidi="en_US"/>
         </w:rPr>
-        <w:t>Bela’s son from Benjamin’s tribe (</w:t>
+        <w:t>Iri was Bela’s son from the tribe of Benjamin (</w:t>
       </w:r>
       <w:hyperlink r:id="rId621">
         <w:r>
@@ -24011,7 +24059,7 @@
             <w:color w:val="0000EE"/>
             <w:u w:val="single"/>
           </w:rPr>
-          <w:t>1 Chr 7:7</w:t>
+          <w:t>1 Chronicles 7:7</w:t>
         </w:r>
       </w:hyperlink>
       <w:r>
@@ -24800,7 +24848,7 @@
         <w:rPr>
           <w:lang w:val="en_US" w:bidi="en_US"/>
         </w:rPr>
-        <w:t>Caleb’s son from Judah’s tribe (</w:t>
+        <w:t>Iru was Caleb’s son from the tribe of Judah (</w:t>
       </w:r>
       <w:hyperlink r:id="rId641">
         <w:r>
@@ -24811,7 +24859,7 @@
             <w:color w:val="0000EE"/>
             <w:u w:val="single"/>
           </w:rPr>
-          <w:t>1 Chr 4:15</w:t>
+          <w:t>1 Chronicles 4:15</w:t>
         </w:r>
       </w:hyperlink>
       <w:r>
@@ -31980,7 +32028,7 @@
         <w:rPr>
           <w:lang w:val="en_US" w:bidi="en_US"/>
         </w:rPr>
-        <w:t>Hammoleketh’s son from Manasseh’s tribe (</w:t>
+        <w:t>Ishhod was Hammolecheth’s son from the tribe of Manasseh (</w:t>
       </w:r>
       <w:hyperlink r:id="rId883">
         <w:r>
@@ -31991,7 +32039,7 @@
             <w:color w:val="0000EE"/>
             <w:u w:val="single"/>
           </w:rPr>
-          <w:t>1 Chr 7:18</w:t>
+          <w:t>1 Chronicles 7:18</w:t>
         </w:r>
       </w:hyperlink>
       <w:r>
@@ -32430,7 +32478,7 @@
         <w:rPr>
           <w:lang w:val="en_US" w:bidi="en_US"/>
         </w:rPr>
-        <w:t>Etam’s son from Judah’s tribe (</w:t>
+        <w:t>Ishma was Etam’s son from the tribe of Judah (</w:t>
       </w:r>
       <w:hyperlink r:id="rId37">
         <w:r>
@@ -32441,7 +32489,7 @@
             <w:color w:val="0000EE"/>
             <w:u w:val="single"/>
           </w:rPr>
-          <w:t>1 Chr 4:3</w:t>
+          <w:t>1 Chronicles 4:3</w:t>
         </w:r>
       </w:hyperlink>
       <w:r>
@@ -33831,7 +33879,7 @@
         <w:rPr>
           <w:lang w:val="en_US" w:bidi="en_US"/>
         </w:rPr>
-        <w:t>Beriah’s son from Benjamin’s tribe (</w:t>
+        <w:t>Ishpah was Beriah’s son from the tribe of Benjamin (</w:t>
       </w:r>
       <w:hyperlink r:id="rId921">
         <w:r>
@@ -33842,7 +33890,7 @@
             <w:color w:val="0000EE"/>
             <w:u w:val="single"/>
           </w:rPr>
-          <w:t>1 Chr 8:16</w:t>
+          <w:t>1 Chronicles 8:16</w:t>
         </w:r>
       </w:hyperlink>
       <w:r>
@@ -35219,6 +35267,34 @@
       </w:r>
       <w:r>
         <w:rPr>
+          <w:lang w:val="en_US" w:bidi="en_US"/>
+        </w:rPr>
+        <w:t>Israel is the name of the land connected with the people of Israel in the Bible. The name may refer to the whole land where the Israelites lived. In some passages, it may refer more specifically to the northern kingdom of Israel.</w:t>
+      </w:r>
+    </w:p>
+    <w:p>
+      <w:pPr/>
+      <w:r>
+        <w:rPr>
+          <w:lang w:val="en_US" w:bidi="en_US"/>
+        </w:rPr>
+      </w:r>
+      <w:r>
+        <w:rPr>
+          <w:lang w:val="en_US" w:bidi="en_US"/>
+        </w:rPr>
+        <w:t>The borders and political divisions of the land changed during different periods of biblical history.</w:t>
+      </w:r>
+    </w:p>
+    <w:p>
+      <w:pPr/>
+      <w:r>
+        <w:rPr>
+          <w:lang w:val="en_US" w:bidi="en_US"/>
+        </w:rPr>
+      </w:r>
+      <w:r>
+        <w:rPr>
           <w:i/>
           <w:lang w:val="en_US" w:bidi="en_US"/>
         </w:rPr>
@@ -37781,7 +37857,7 @@
         <w:rPr>
           <w:lang w:val="en_US" w:bidi="en_US"/>
         </w:rPr>
-        <w:t>Town in southern Judah (</w:t>
+        <w:t>Ithnan was a town in southern Judah (</w:t>
       </w:r>
       <w:hyperlink r:id="rId970">
         <w:r>
@@ -37792,7 +37868,7 @@
             <w:color w:val="0000EE"/>
             <w:u w:val="single"/>
           </w:rPr>
-          <w:t>Jos 15:23</w:t>
+          <w:t>Joshua 15:23</w:t>
         </w:r>
       </w:hyperlink>
       <w:r>
@@ -38782,7 +38858,15 @@
         <w:rPr>
           <w:lang w:val="en_US" w:bidi="en_US"/>
         </w:rPr>
-        <w:t xml:space="preserve">KJV spelling of Ivvah. </w:t>
+        <w:t>Ivah is the King James Version spelling of Ivvah.</w:t>
+      </w:r>
+    </w:p>
+    <w:p>
+      <w:pPr/>
+      <w:r>
+        <w:rPr>
+          <w:lang w:val="en_US" w:bidi="en_US"/>
+        </w:rPr>
       </w:r>
       <w:r>
         <w:rPr>
@@ -39147,7 +39231,7 @@
         <w:rPr>
           <w:lang w:val="en_US" w:bidi="en_US"/>
         </w:rPr>
-        <w:t>City that had already fallen along with others to the Assyrians (</w:t>
+        <w:t>Ivvah was a city that had already fallen along with others to the Assyrians (</w:t>
       </w:r>
       <w:hyperlink r:id="rId998">
         <w:r>
@@ -39158,7 +39242,7 @@
             <w:color w:val="0000EE"/>
             <w:u w:val="single"/>
           </w:rPr>
-          <w:t>2 Kgs 18:34</w:t>
+          <w:t>2 Kings 18:34</w:t>
         </w:r>
       </w:hyperlink>
       <w:r>
@@ -39194,14 +39278,14 @@
             <w:color w:val="0000EE"/>
             <w:u w:val="single"/>
           </w:rPr>
-          <w:t>Is 37:13</w:t>
-        </w:r>
-      </w:hyperlink>
-      <w:r>
-        <w:rPr>
-          <w:lang w:val="en_US" w:bidi="en_US"/>
-        </w:rPr>
-        <w:t>). Sennacherib’s representative mocked Hezekiah’s belief that God would save Jerusalem. Ivvah was probably in Syria.</w:t>
+          <w:t>Isaiah 37:13</w:t>
+        </w:r>
+      </w:hyperlink>
+      <w:r>
+        <w:rPr>
+          <w:lang w:val="en_US" w:bidi="en_US"/>
+        </w:rPr>
+        <w:t>). A representative of King Sennacherib mocked the belief of King Hezekiah that God would save Jerusalem. Ivvah was probably a city in Syria.</w:t>
       </w:r>
     </w:p>
     <w:p>
@@ -39872,7 +39956,7 @@
         <w:rPr>
           <w:lang w:val="en_US" w:bidi="en_US"/>
         </w:rPr>
-        <w:t>Elpaal’s son from Benjamin’s tribe (</w:t>
+        <w:t>Izliah was Elpaal’s son from the tribe of Benjamin (</w:t>
       </w:r>
       <w:hyperlink r:id="rId920">
         <w:r>
@@ -39883,7 +39967,7 @@
             <w:color w:val="0000EE"/>
             <w:u w:val="single"/>
           </w:rPr>
-          <w:t>1 Chr 8:18</w:t>
+          <w:t>1 Chronicles 8:18</w:t>
         </w:r>
       </w:hyperlink>
       <w:r>

</xml_diff>

<commit_message>
Update AquiferOpenBibleDictionary for 2026-08-11 release
</commit_message>
<xml_diff>
--- a/eng/docx/009.content.docx
+++ b/eng/docx/009.content.docx
@@ -1994,7 +1994,35 @@
         <w:rPr>
           <w:lang w:val="en_US" w:bidi="en_US"/>
         </w:rPr>
-        <w:t>Man-made images or natural representations worshiped as deities; anything receiving worship other than the one true God. Idolatry is the spiritual worship of an idol. Many idolaters literally serve idols: in ancient Egypt statues of gods were regularly and ritually clothed and fed. Some concept of the worship of a false god, Baal, is given in the account of the contest on Mt Carmel: the priests of Baal cried aloud, they “limped” (rsv) around the altar, they cut themselves with swords and lances (</w:t>
+        <w:t>An idol is a human-made image or an image of something in the natural world that people worship as a god. It can also be anything that receives worship that belongs only to the one true God. Idolatry is the worship of an idol.</w:t>
+      </w:r>
+    </w:p>
+    <w:p>
+      <w:pPr/>
+      <w:r>
+        <w:rPr>
+          <w:lang w:val="en_US" w:bidi="en_US"/>
+        </w:rPr>
+      </w:r>
+      <w:r>
+        <w:rPr>
+          <w:lang w:val="en_US" w:bidi="en_US"/>
+        </w:rPr>
+        <w:t>Some people served idols in very literal ways. In ancient Egypt, people regularly dressed statues of gods and gave them food as part of religious ceremonies.</w:t>
+      </w:r>
+    </w:p>
+    <w:p>
+      <w:pPr/>
+      <w:r>
+        <w:rPr>
+          <w:lang w:val="en_US" w:bidi="en_US"/>
+        </w:rPr>
+      </w:r>
+      <w:r>
+        <w:rPr>
+          <w:lang w:val="en_US" w:bidi="en_US"/>
+        </w:rPr>
+        <w:t>The Bible gives an example of the worship of the false god Baal in the contest on Mount Carmel. The priests of Baal shouted loudly, moved around the altar, and cut themselves with “knives and lances” (</w:t>
       </w:r>
       <w:hyperlink r:id="rId50">
         <w:r>
@@ -2005,14 +2033,14 @@
             <w:color w:val="0000EE"/>
             <w:u w:val="single"/>
           </w:rPr>
-          <w:t>1 Kgs 18:26–29</w:t>
-        </w:r>
-      </w:hyperlink>
-      <w:r>
-        <w:rPr>
-          <w:lang w:val="en_US" w:bidi="en_US"/>
-        </w:rPr>
-        <w:t>). Baal worship was widely followed by Israel during the period of the monarchy.</w:t>
+          <w:t>1 Kings 18:26–29</w:t>
+        </w:r>
+      </w:hyperlink>
+      <w:r>
+        <w:rPr>
+          <w:lang w:val="en_US" w:bidi="en_US"/>
+        </w:rPr>
+        <w:t>). Baal worship became common among the people of Israel during the time of the kings.</w:t>
       </w:r>
     </w:p>
     <w:p>
@@ -2023,21 +2051,21 @@
         <w:rPr>
           <w:lang w:val="en_US" w:bidi="en_US"/>
         </w:rPr>
-        <w:t>In the Old Testament</w:t>
-      </w:r>
-    </w:p>
-    <w:p>
-      <w:pPr/>
-      <w:r>
-        <w:rPr>
-          <w:lang w:val="en_US" w:bidi="en_US"/>
-        </w:rPr>
-      </w:r>
-      <w:r>
-        <w:rPr>
-          <w:lang w:val="en_US" w:bidi="en_US"/>
-        </w:rPr>
-        <w:t>Abraham’s ancestors were worshipers of idols in Mesopotamia (</w:t>
+        <w:t>Idols and Idolatry in the Old Testament</w:t>
+      </w:r>
+    </w:p>
+    <w:p>
+      <w:pPr/>
+      <w:r>
+        <w:rPr>
+          <w:lang w:val="en_US" w:bidi="en_US"/>
+        </w:rPr>
+      </w:r>
+      <w:r>
+        <w:rPr>
+          <w:lang w:val="en_US" w:bidi="en_US"/>
+        </w:rPr>
+        <w:t>Abraham’s ancestors worshiped idols in Mesopotamia (</w:t>
       </w:r>
       <w:hyperlink r:id="rId51">
         <w:r>
@@ -2048,28 +2076,56 @@
             <w:color w:val="0000EE"/>
             <w:u w:val="single"/>
           </w:rPr>
-          <w:t>Jos 24:2</w:t>
-        </w:r>
-      </w:hyperlink>
-      <w:r>
-        <w:rPr>
-          <w:lang w:val="en_US" w:bidi="en_US"/>
-        </w:rPr>
-        <w:t>). Archaeological excavations in that area have revealed the images of numerous deities, and Mesopotamian religious literature reveals the gross polytheism out of which Abraham came. The tendency of the Israelites toward idolatry was in part the expression of the universal human longing for a god one can see and know through the physical senses.</w:t>
-      </w:r>
-    </w:p>
-    <w:p>
-      <w:pPr/>
-      <w:r>
-        <w:rPr>
-          <w:lang w:val="en_US" w:bidi="en_US"/>
-        </w:rPr>
-      </w:r>
-      <w:r>
-        <w:rPr>
-          <w:lang w:val="en_US" w:bidi="en_US"/>
-        </w:rPr>
-        <w:t>Most of the idolatry of the Israelites was borrowed from their neighbors. During the more than 400 years that the descendants of Jacob spent in Egypt, they were exposed to polytheistic idolatry, which influenced their religious mind-set. At Sinai, while Moses was receiving the Ten Commandments from the Lord, the people were demanding that Aaron make gods for them (</w:t>
+          <w:t>Joshua 24:2</w:t>
+        </w:r>
+      </w:hyperlink>
+      <w:r>
+        <w:rPr>
+          <w:lang w:val="en_US" w:bidi="en_US"/>
+        </w:rPr>
+        <w:t>). Archaeologists have found many images of gods in that region. Ancient Mesopotamian religious writings also show that people worshiped many gods. This belief in many gods is called polytheism.</w:t>
+      </w:r>
+    </w:p>
+    <w:p>
+      <w:pPr/>
+      <w:r>
+        <w:rPr>
+          <w:lang w:val="en_US" w:bidi="en_US"/>
+        </w:rPr>
+      </w:r>
+      <w:r>
+        <w:rPr>
+          <w:lang w:val="en_US" w:bidi="en_US"/>
+        </w:rPr>
+        <w:t>The Israelites also struggled with idolatry. Part of this may have come from a common human desire to worship a god that people can see and experience through their physical senses.</w:t>
+      </w:r>
+    </w:p>
+    <w:p>
+      <w:pPr/>
+      <w:r>
+        <w:rPr>
+          <w:lang w:val="en_US" w:bidi="en_US"/>
+        </w:rPr>
+      </w:r>
+      <w:r>
+        <w:rPr>
+          <w:lang w:val="en_US" w:bidi="en_US"/>
+        </w:rPr>
+        <w:t>The Israelites adopted many forms of idol worship from the peoples around them. The descendants of Jacob lived in Egypt for more than 400 years. During this time, they were exposed to the worship of many gods. This influenced their religious beliefs and practices.</w:t>
+      </w:r>
+    </w:p>
+    <w:p>
+      <w:pPr/>
+      <w:r>
+        <w:rPr>
+          <w:lang w:val="en_US" w:bidi="en_US"/>
+        </w:rPr>
+      </w:r>
+      <w:r>
+        <w:rPr>
+          <w:lang w:val="en_US" w:bidi="en_US"/>
+        </w:rPr>
+        <w:t>At Mount Sinai, Moses was receiving the Ten Commandments from the Lord. Meanwhile, the people asked Aaron to make gods for them (</w:t>
       </w:r>
       <w:hyperlink r:id="rId52">
         <w:r>
@@ -2080,28 +2136,28 @@
             <w:color w:val="0000EE"/>
             <w:u w:val="single"/>
           </w:rPr>
-          <w:t>Ex 32:1–6</w:t>
-        </w:r>
-      </w:hyperlink>
-      <w:r>
-        <w:rPr>
-          <w:lang w:val="en_US" w:bidi="en_US"/>
-        </w:rPr>
-        <w:t>). He fashioned a golden calf, following an Egyptian form, for the whole bovine family was worshiped in Egypt—the Apis bull, the Hathor cow, and the Mnevis calf.</w:t>
-      </w:r>
-    </w:p>
-    <w:p>
-      <w:pPr/>
-      <w:r>
-        <w:rPr>
-          <w:lang w:val="en_US" w:bidi="en_US"/>
-        </w:rPr>
-      </w:r>
-      <w:r>
-        <w:rPr>
-          <w:lang w:val="en_US" w:bidi="en_US"/>
-        </w:rPr>
-        <w:t>It was after his stay in Egypt (</w:t>
+          <w:t>Exodus 32:1–6</w:t>
+        </w:r>
+      </w:hyperlink>
+      <w:r>
+        <w:rPr>
+          <w:lang w:val="en_US" w:bidi="en_US"/>
+        </w:rPr>
+        <w:t>). Aaron made a golden calf. This image was similar to Egyptian forms of worship. The Egyptians worshiped several gods represented by cattle, including the Apis bull, the goddess Hathor, who was often shown as a cow, and the Mnevis calf.</w:t>
+      </w:r>
+    </w:p>
+    <w:p>
+      <w:pPr/>
+      <w:r>
+        <w:rPr>
+          <w:lang w:val="en_US" w:bidi="en_US"/>
+        </w:rPr>
+      </w:r>
+      <w:r>
+        <w:rPr>
+          <w:lang w:val="en_US" w:bidi="en_US"/>
+        </w:rPr>
+        <w:t>After Jeroboam spent time in Egypt (</w:t>
       </w:r>
       <w:hyperlink r:id="rId53">
         <w:r>
@@ -2112,14 +2168,14 @@
             <w:color w:val="0000EE"/>
             <w:u w:val="single"/>
           </w:rPr>
-          <w:t>1 Kgs 11:40</w:t>
-        </w:r>
-      </w:hyperlink>
-      <w:r>
-        <w:rPr>
-          <w:lang w:val="en_US" w:bidi="en_US"/>
-        </w:rPr>
-        <w:t>) that Jeroboam became king of Israel and set up golden calves, one at Bethel and one at Dan (</w:t>
+          <w:t>1 Kings 11:40</w:t>
+        </w:r>
+      </w:hyperlink>
+      <w:r>
+        <w:rPr>
+          <w:lang w:val="en_US" w:bidi="en_US"/>
+        </w:rPr>
+        <w:t>), he became king of Israel. He later set up two golden calves, one at Bethel and one at Dan (</w:t>
       </w:r>
       <w:hyperlink r:id="rId54">
         <w:r>
@@ -2137,7 +2193,7 @@
         <w:rPr>
           <w:lang w:val="en_US" w:bidi="en_US"/>
         </w:rPr>
-        <w:t>), an action that earned him the label as being the one who made Israel sin (</w:t>
+        <w:t>). Because of this, the Bible describes Jeroboam as the king who caused Israel to sin (</w:t>
       </w:r>
       <w:hyperlink r:id="rId55">
         <w:r>
@@ -2148,7 +2204,7 @@
             <w:color w:val="0000EE"/>
             <w:u w:val="single"/>
           </w:rPr>
-          <w:t>2 Kgs 3:3</w:t>
+          <w:t>2 Kings 3:3</w:t>
         </w:r>
       </w:hyperlink>
       <w:r>
@@ -2159,17 +2215,54 @@
       </w:r>
     </w:p>
     <w:p>
-      <w:pPr/>
-      <w:r>
-        <w:rPr>
-          <w:lang w:val="en_US" w:bidi="en_US"/>
-        </w:rPr>
-      </w:r>
-      <w:r>
-        <w:rPr>
-          <w:lang w:val="en_US" w:bidi="en_US"/>
-        </w:rPr>
-        <w:t>Already in patriarchal times there are references to the teraphim, or household gods. Examples of these idols have been found at Ur of the Chaldees, Nuzi, and other sites, and are referred to in the cuneiform tablets. The teraphim that Rachel stole from Laban could be hidden in her camel’s saddlebag (</w:t>
+      <w:pPr>
+        <w:pStyle w:val="Heading4"/>
+      </w:pPr>
+      <w:r>
+        <w:rPr>
+          <w:lang w:val="en_US" w:bidi="en_US"/>
+        </w:rPr>
+        <w:t>Household Gods in Israel</w:t>
+      </w:r>
+    </w:p>
+    <w:p>
+      <w:pPr/>
+      <w:r>
+        <w:rPr>
+          <w:lang w:val="en_US" w:bidi="en_US"/>
+        </w:rPr>
+      </w:r>
+      <w:r>
+        <w:rPr>
+          <w:lang w:val="en_US" w:bidi="en_US"/>
+        </w:rPr>
+        <w:t xml:space="preserve">In the time of the patriarchs, the Bible mentions </w:t>
+      </w:r>
+      <w:r>
+        <w:rPr>
+          <w:i/>
+          <w:lang w:val="en_US" w:bidi="en_US"/>
+        </w:rPr>
+        <w:t>teraphim</w:t>
+      </w:r>
+      <w:r>
+        <w:rPr>
+          <w:lang w:val="en_US" w:bidi="en_US"/>
+        </w:rPr>
+        <w:t xml:space="preserve">, or household gods. Archaeologists have found examples of these idols at Ur of the Chaldeans, Nuzi, and other ancient sites. Ancient cuneiform tablets, which were written on clay, also mention them. The </w:t>
+      </w:r>
+      <w:r>
+        <w:rPr>
+          <w:i/>
+          <w:lang w:val="en_US" w:bidi="en_US"/>
+        </w:rPr>
+        <w:t>teraphim</w:t>
+      </w:r>
+      <w:r>
+        <w:rPr>
+          <w:lang w:val="en_US" w:bidi="en_US"/>
+        </w:rPr>
+        <w:t xml:space="preserve"> that Rachel stole from Laban were small enough to hide in a camel’s saddlebag (</w:t>
       </w:r>
       <w:hyperlink r:id="rId56">
         <w:r>
@@ -2180,14 +2273,28 @@
             <w:color w:val="0000EE"/>
             <w:u w:val="single"/>
           </w:rPr>
-          <w:t>Gn 31:34</w:t>
-        </w:r>
-      </w:hyperlink>
-      <w:r>
-        <w:rPr>
-          <w:lang w:val="en_US" w:bidi="en_US"/>
-        </w:rPr>
-        <w:t>). It seems, however, that in the time of David such idols were larger, for when Saul’s men came to kill David, Michal, David’s wife and the daughter of Saul, helped David to escape and then took such an image and placed it in a bed to make the men think that David was sick (</w:t>
+          <w:t>Genesis 31:34</w:t>
+        </w:r>
+      </w:hyperlink>
+      <w:r>
+        <w:rPr>
+          <w:lang w:val="en_US" w:bidi="en_US"/>
+        </w:rPr>
+        <w:t xml:space="preserve">). </w:t>
+      </w:r>
+    </w:p>
+    <w:p>
+      <w:pPr/>
+      <w:r>
+        <w:rPr>
+          <w:lang w:val="en_US" w:bidi="en_US"/>
+        </w:rPr>
+      </w:r>
+      <w:r>
+        <w:rPr>
+          <w:lang w:val="en_US" w:bidi="en_US"/>
+        </w:rPr>
+        <w:t>However, by the time of David, some of these idols seem to have been larger. When Saul’s men came to kill David, Michal, David's wife and daughter of Saul, helped David escape. She then placed a household idol in the bed so that the men would think David was sick (</w:t>
       </w:r>
       <w:hyperlink r:id="rId57">
         <w:r>
@@ -2198,7 +2305,7 @@
             <w:color w:val="0000EE"/>
             <w:u w:val="single"/>
           </w:rPr>
-          <w:t>1 Sm 19:11–16</w:t>
+          <w:t>1 Samuel 19:11–16</w:t>
         </w:r>
       </w:hyperlink>
       <w:r>
@@ -2209,17 +2316,28 @@
       </w:r>
     </w:p>
     <w:p>
-      <w:pPr/>
-      <w:r>
-        <w:rPr>
-          <w:lang w:val="en_US" w:bidi="en_US"/>
-        </w:rPr>
-      </w:r>
-      <w:r>
-        <w:rPr>
-          <w:lang w:val="en_US" w:bidi="en_US"/>
-        </w:rPr>
-        <w:t>The prohibition of idolatry is explicitly stated in the second commandment (</w:t>
+      <w:pPr>
+        <w:pStyle w:val="Heading4"/>
+      </w:pPr>
+      <w:r>
+        <w:rPr>
+          <w:lang w:val="en_US" w:bidi="en_US"/>
+        </w:rPr>
+        <w:t>God's Commands Against Idolatry</w:t>
+      </w:r>
+    </w:p>
+    <w:p>
+      <w:pPr/>
+      <w:r>
+        <w:rPr>
+          <w:lang w:val="en_US" w:bidi="en_US"/>
+        </w:rPr>
+      </w:r>
+      <w:r>
+        <w:rPr>
+          <w:lang w:val="en_US" w:bidi="en_US"/>
+        </w:rPr>
+        <w:t>The second commandment clearly forbids idolatry (</w:t>
       </w:r>
       <w:hyperlink r:id="rId58">
         <w:r>
@@ -2230,14 +2348,28 @@
             <w:color w:val="0000EE"/>
             <w:u w:val="single"/>
           </w:rPr>
-          <w:t>Ex 20:4–5</w:t>
-        </w:r>
-      </w:hyperlink>
-      <w:r>
-        <w:rPr>
-          <w:lang w:val="en_US" w:bidi="en_US"/>
-        </w:rPr>
-        <w:t xml:space="preserve">, nlt): “Do not make idols of any kind, whether in the shape of birds or animals or fish. You must never worship or bow down to them, for I, the Lord your God, am a jealous God who will not share your affection with any other god!” (cf. </w:t>
+          <w:t>Exodus 20:4–5</w:t>
+        </w:r>
+      </w:hyperlink>
+      <w:r>
+        <w:rPr>
+          <w:lang w:val="en_US" w:bidi="en_US"/>
+        </w:rPr>
+        <w:t>):</w:t>
+      </w:r>
+    </w:p>
+    <w:p>
+      <w:pPr/>
+      <w:r>
+        <w:rPr>
+          <w:lang w:val="en_US" w:bidi="en_US"/>
+        </w:rPr>
+      </w:r>
+      <w:r>
+        <w:rPr>
+          <w:lang w:val="en_US" w:bidi="en_US"/>
+        </w:rPr>
+        <w:t xml:space="preserve"> “You shall not make for yourself an idol in the form of anything in the heavens above, on the earth below, or in the waters beneath. You shall not bow down to them or worship them; for I, the LORD your God, am a jealous God” (see also </w:t>
       </w:r>
       <w:hyperlink r:id="rId59">
         <w:r>
@@ -2248,7 +2380,7 @@
             <w:color w:val="0000EE"/>
             <w:u w:val="single"/>
           </w:rPr>
-          <w:t>Ex 34:17</w:t>
+          <w:t>Exodus 34:17</w:t>
         </w:r>
       </w:hyperlink>
       <w:r>
@@ -2266,7 +2398,7 @@
             <w:color w:val="0000EE"/>
             <w:u w:val="single"/>
           </w:rPr>
-          <w:t>Lv 19:4</w:t>
+          <w:t>Leviticus 19:4</w:t>
         </w:r>
       </w:hyperlink>
       <w:r>
@@ -2302,7 +2434,7 @@
             <w:color w:val="0000EE"/>
             <w:u w:val="single"/>
           </w:rPr>
-          <w:t>Dt 4:15–19</w:t>
+          <w:t>Deuteronomy 4:15–19</w:t>
         </w:r>
       </w:hyperlink>
       <w:r>
@@ -2327,7 +2459,47 @@
         <w:rPr>
           <w:lang w:val="en_US" w:bidi="en_US"/>
         </w:rPr>
-        <w:t>). This commandment is an extension or auxiliary of the first, for it seeks to preserve God’s uniqueness and to protect his glory. The definition of idolatry was broadened during the time of Samuel, who confronted King Saul with the charge that stubbornness is the same as idolatry (</w:t>
+        <w:t xml:space="preserve">). </w:t>
+      </w:r>
+    </w:p>
+    <w:p>
+      <w:pPr/>
+      <w:r>
+        <w:rPr>
+          <w:lang w:val="en_US" w:bidi="en_US"/>
+        </w:rPr>
+      </w:r>
+      <w:r>
+        <w:rPr>
+          <w:lang w:val="en_US" w:bidi="en_US"/>
+        </w:rPr>
+        <w:t>This commandment supports the first commandment. It protects the truth that God is unique and that his glory belongs to him alone.</w:t>
+      </w:r>
+    </w:p>
+    <w:p>
+      <w:pPr/>
+      <w:r>
+        <w:rPr>
+          <w:lang w:val="en_US" w:bidi="en_US"/>
+        </w:rPr>
+      </w:r>
+      <w:r>
+        <w:rPr>
+          <w:lang w:val="en_US" w:bidi="en_US"/>
+        </w:rPr>
+        <w:t>In the time of Samuel, the idea of idolatry was also applied more broadly. Samuel told King Saul that “</w:t>
+      </w:r>
+      <w:r>
+        <w:rPr>
+          <w:lang w:val="en_US" w:bidi="en_US"/>
+        </w:rPr>
+        <w:t>arrogance is like the wickedness of idolatry”</w:t>
+      </w:r>
+      <w:r>
+        <w:rPr>
+          <w:lang w:val="en_US" w:bidi="en_US"/>
+        </w:rPr>
+        <w:t xml:space="preserve"> (</w:t>
       </w:r>
       <w:hyperlink r:id="rId64">
         <w:r>
@@ -2338,7 +2510,7 @@
             <w:color w:val="0000EE"/>
             <w:u w:val="single"/>
           </w:rPr>
-          <w:t>1 Sm 15:23</w:t>
+          <w:t>1 Samuel 15:23</w:t>
         </w:r>
       </w:hyperlink>
       <w:r>
@@ -2359,7 +2531,7 @@
         <w:rPr>
           <w:lang w:val="en_US" w:bidi="en_US"/>
         </w:rPr>
-        <w:t>Previous to the conquest of Canaan, the Lord kept warning Israel against marrying members of the native populace, which he had ordered Israel to annihilate. This measure was intended to prevent the weakening of moral life in Israel (</w:t>
+        <w:t>Before Israel entered Canaan, the Lord repeatedly warned the Israelites not to marry people from the nations living there. God had commanded Israel to remove those nations from the land. One purpose of this command was to keep Israel from being led away from faithful obedience to God (</w:t>
       </w:r>
       <w:hyperlink r:id="rId65">
         <w:r>
@@ -2370,7 +2542,7 @@
             <w:color w:val="0000EE"/>
             <w:u w:val="single"/>
           </w:rPr>
-          <w:t>Ex 34:16</w:t>
+          <w:t>Exodus 34:16</w:t>
         </w:r>
       </w:hyperlink>
       <w:r>
@@ -2388,14 +2560,28 @@
             <w:color w:val="0000EE"/>
             <w:u w:val="single"/>
           </w:rPr>
-          <w:t>Dt 7:3–4</w:t>
-        </w:r>
-      </w:hyperlink>
-      <w:r>
-        <w:rPr>
-          <w:lang w:val="en_US" w:bidi="en_US"/>
-        </w:rPr>
-        <w:t xml:space="preserve">). This principle is again expanded in the NT (cf. </w:t>
+          <w:t>Deuteronomy 7:3–4</w:t>
+        </w:r>
+      </w:hyperlink>
+      <w:r>
+        <w:rPr>
+          <w:lang w:val="en_US" w:bidi="en_US"/>
+        </w:rPr>
+        <w:t xml:space="preserve">). </w:t>
+      </w:r>
+    </w:p>
+    <w:p>
+      <w:pPr/>
+      <w:r>
+        <w:rPr>
+          <w:lang w:val="en_US" w:bidi="en_US"/>
+        </w:rPr>
+      </w:r>
+      <w:r>
+        <w:rPr>
+          <w:lang w:val="en_US" w:bidi="en_US"/>
+        </w:rPr>
+        <w:t xml:space="preserve">The New Testament also teaches that close relationships can influence a person’s faith and conduct (see </w:t>
       </w:r>
       <w:hyperlink r:id="rId67">
         <w:r>
@@ -2406,7 +2592,7 @@
             <w:color w:val="0000EE"/>
             <w:u w:val="single"/>
           </w:rPr>
-          <w:t>1 Cor 15:33</w:t>
+          <w:t>1 Corinthians 15:33</w:t>
         </w:r>
       </w:hyperlink>
       <w:r>
@@ -2424,14 +2610,28 @@
             <w:color w:val="0000EE"/>
             <w:u w:val="single"/>
           </w:rPr>
-          <w:t>2 Cor 6:14</w:t>
-        </w:r>
-      </w:hyperlink>
-      <w:r>
-        <w:rPr>
-          <w:lang w:val="en_US" w:bidi="en_US"/>
-        </w:rPr>
-        <w:t>). The history of Israel demonstrated the practicality of the prohibition against such marriages, for they inevitably led to apostasy. Perhaps the saddest example is Solomon (</w:t>
+          <w:t>2 Corinthians 6:14</w:t>
+        </w:r>
+      </w:hyperlink>
+      <w:r>
+        <w:rPr>
+          <w:lang w:val="en_US" w:bidi="en_US"/>
+        </w:rPr>
+        <w:t xml:space="preserve">). </w:t>
+      </w:r>
+    </w:p>
+    <w:p>
+      <w:pPr/>
+      <w:r>
+        <w:rPr>
+          <w:lang w:val="en_US" w:bidi="en_US"/>
+        </w:rPr>
+      </w:r>
+      <w:r>
+        <w:rPr>
+          <w:lang w:val="en_US" w:bidi="en_US"/>
+        </w:rPr>
+        <w:t>Israel’s history shows the danger behind this warning. Marriages with people who worshiped other gods often led the Israelites away from the Lord. One of the clearest examples is Solomon (</w:t>
       </w:r>
       <w:hyperlink r:id="rId69">
         <w:r>
@@ -2442,14 +2642,14 @@
             <w:color w:val="0000EE"/>
             <w:u w:val="single"/>
           </w:rPr>
-          <w:t>1 Kgs 11:1–8</w:t>
-        </w:r>
-      </w:hyperlink>
-      <w:r>
-        <w:rPr>
-          <w:lang w:val="en_US" w:bidi="en_US"/>
-        </w:rPr>
-        <w:t xml:space="preserve">). When Solomon was old, his wives turned his heart to other gods, so that he was not wholly true to the Lord his God (v </w:t>
+          <w:t>1 Kings 11:1–8</w:t>
+        </w:r>
+      </w:hyperlink>
+      <w:r>
+        <w:rPr>
+          <w:lang w:val="en_US" w:bidi="en_US"/>
+        </w:rPr>
+        <w:t xml:space="preserve">). When Solomon grew old, his wives turned his heart toward other gods, and he was no longer fully faithful to the Lord his God (verse </w:t>
       </w:r>
       <w:hyperlink r:id="rId70">
         <w:r>
@@ -2471,17 +2671,28 @@
       </w:r>
     </w:p>
     <w:p>
-      <w:pPr/>
-      <w:r>
-        <w:rPr>
-          <w:lang w:val="en_US" w:bidi="en_US"/>
-        </w:rPr>
-      </w:r>
-      <w:r>
-        <w:rPr>
-          <w:lang w:val="en_US" w:bidi="en_US"/>
-        </w:rPr>
-        <w:t>In the time of the judges there was an infamous case of idol worship (</w:t>
+      <w:pPr>
+        <w:pStyle w:val="Heading4"/>
+      </w:pPr>
+      <w:r>
+        <w:rPr>
+          <w:lang w:val="en_US" w:bidi="en_US"/>
+        </w:rPr>
+        <w:t>Idolatry in the Time of the Judges</w:t>
+      </w:r>
+    </w:p>
+    <w:p>
+      <w:pPr/>
+      <w:r>
+        <w:rPr>
+          <w:lang w:val="en_US" w:bidi="en_US"/>
+        </w:rPr>
+      </w:r>
+      <w:r>
+        <w:rPr>
+          <w:lang w:val="en_US" w:bidi="en_US"/>
+        </w:rPr>
+        <w:t>During the time of the judges, the Bible describes a well-known case of idol worship (</w:t>
       </w:r>
       <w:hyperlink r:id="rId71">
         <w:r>
@@ -2492,14 +2703,55 @@
             <w:color w:val="0000EE"/>
             <w:u w:val="single"/>
           </w:rPr>
-          <w:t>Jgs 17:1–18:31</w:t>
-        </w:r>
-      </w:hyperlink>
-      <w:r>
-        <w:rPr>
-          <w:lang w:val="en_US" w:bidi="en_US"/>
-        </w:rPr>
-        <w:t>). The mother of an Ephraimite named Micah took 200 pieces of silver and had a silversmith make them into a graven image for her son. He also had a shrine, an ephod, and teraphim. He hired a wandering Levite to be his priest, but men from the tribe of Dan came along and took the Levite, the image, and all the accoutrements and set up this idol at Dan and used it as an object of their worship (</w:t>
+          <w:t>Judges 17:1–18:31</w:t>
+        </w:r>
+      </w:hyperlink>
+      <w:r>
+        <w:rPr>
+          <w:lang w:val="en_US" w:bidi="en_US"/>
+        </w:rPr>
+        <w:t>). The mother of a man from Ephraim named Micah gave 200 pieces of silver to a silversmith. He used the silver to make an idol for her son.</w:t>
+      </w:r>
+    </w:p>
+    <w:p>
+      <w:pPr/>
+      <w:r>
+        <w:rPr>
+          <w:lang w:val="en_US" w:bidi="en_US"/>
+        </w:rPr>
+      </w:r>
+      <w:r>
+        <w:rPr>
+          <w:lang w:val="en_US" w:bidi="en_US"/>
+        </w:rPr>
+        <w:t xml:space="preserve">Micah also had a shrine, an ephod, which was a special religious garment or object, and </w:t>
+      </w:r>
+      <w:r>
+        <w:rPr>
+          <w:i/>
+          <w:lang w:val="en_US" w:bidi="en_US"/>
+        </w:rPr>
+        <w:t>teraphim</w:t>
+      </w:r>
+      <w:r>
+        <w:rPr>
+          <w:lang w:val="en_US" w:bidi="en_US"/>
+        </w:rPr>
+        <w:t>, or household gods. He hired a traveling Levite to serve as his priest.</w:t>
+      </w:r>
+    </w:p>
+    <w:p>
+      <w:pPr/>
+      <w:r>
+        <w:rPr>
+          <w:lang w:val="en_US" w:bidi="en_US"/>
+        </w:rPr>
+      </w:r>
+      <w:r>
+        <w:rPr>
+          <w:lang w:val="en_US" w:bidi="en_US"/>
+        </w:rPr>
+        <w:t>Later, men from the tribe of Dan took the Levite, the idol, and the other objects used for worship. They brought them to Dan, set up the idol there, and worshiped it (</w:t>
       </w:r>
       <w:hyperlink r:id="rId72">
         <w:r>
@@ -2510,7 +2762,7 @@
             <w:color w:val="0000EE"/>
             <w:u w:val="single"/>
           </w:rPr>
-          <w:t>18:30–31</w:t>
+          <w:t>Judges 18:30–31</w:t>
         </w:r>
       </w:hyperlink>
       <w:r>
@@ -2521,17 +2773,42 @@
       </w:r>
     </w:p>
     <w:p>
-      <w:pPr/>
-      <w:r>
-        <w:rPr>
-          <w:lang w:val="en_US" w:bidi="en_US"/>
-        </w:rPr>
-      </w:r>
-      <w:r>
-        <w:rPr>
-          <w:lang w:val="en_US" w:bidi="en_US"/>
-        </w:rPr>
-        <w:t>In Scripture the kings of Israel are evaluated on the basis of what they did with respect to the “high places” and idols. Asa removed all the idols his ancestors had made (</w:t>
+      <w:pPr>
+        <w:pStyle w:val="Heading4"/>
+      </w:pPr>
+      <w:r>
+        <w:rPr>
+          <w:lang w:val="en_US" w:bidi="en_US"/>
+        </w:rPr>
+        <w:t>Idolatry and Israel’s Kings</w:t>
+      </w:r>
+    </w:p>
+    <w:p>
+      <w:pPr/>
+      <w:r>
+        <w:rPr>
+          <w:lang w:val="en_US" w:bidi="en_US"/>
+        </w:rPr>
+      </w:r>
+      <w:r>
+        <w:rPr>
+          <w:lang w:val="en_US" w:bidi="en_US"/>
+        </w:rPr>
+        <w:t>In the Bible, the kings of Israel are often judged by how they dealt with the “high places,” which were places of worship, and with idols.</w:t>
+      </w:r>
+    </w:p>
+    <w:p>
+      <w:pPr/>
+      <w:r>
+        <w:rPr>
+          <w:lang w:val="en_US" w:bidi="en_US"/>
+        </w:rPr>
+      </w:r>
+      <w:r>
+        <w:rPr>
+          <w:lang w:val="en_US" w:bidi="en_US"/>
+        </w:rPr>
+        <w:t>King Asa removed the idols his ancestors had made (</w:t>
       </w:r>
       <w:hyperlink r:id="rId73">
         <w:r>
@@ -2542,14 +2819,14 @@
             <w:color w:val="0000EE"/>
             <w:u w:val="single"/>
           </w:rPr>
-          <w:t>1 Kgs 15:12</w:t>
-        </w:r>
-      </w:hyperlink>
-      <w:r>
-        <w:rPr>
-          <w:lang w:val="en_US" w:bidi="en_US"/>
-        </w:rPr>
-        <w:t xml:space="preserve">) and would not let Maacah be queen mother because she had an abominable image made for Asherah. He cut down and burned the image (v </w:t>
+          <w:t>1 Kings 15:12</w:t>
+        </w:r>
+      </w:hyperlink>
+      <w:r>
+        <w:rPr>
+          <w:lang w:val="en_US" w:bidi="en_US"/>
+        </w:rPr>
+        <w:t xml:space="preserve">). He also removed Maacah from her position as queen mother because she had made an offensive image for the goddess Asherah. Asa cut down the image and burned it (verse </w:t>
       </w:r>
       <w:hyperlink r:id="rId74">
         <w:r>
@@ -2567,7 +2844,7 @@
         <w:rPr>
           <w:lang w:val="en_US" w:bidi="en_US"/>
         </w:rPr>
-        <w:t>). The Israelite king Ahab, however, was an idolater (</w:t>
+        <w:t>). King Ahab, however, worshiped idols and led Israel further into idolatry (</w:t>
       </w:r>
       <w:hyperlink r:id="rId75">
         <w:r>
@@ -2578,14 +2855,14 @@
             <w:color w:val="0000EE"/>
             <w:u w:val="single"/>
           </w:rPr>
-          <w:t>1 Kgs 21:26</w:t>
-        </w:r>
-      </w:hyperlink>
-      <w:r>
-        <w:rPr>
-          <w:lang w:val="en_US" w:bidi="en_US"/>
-        </w:rPr>
-        <w:t xml:space="preserve">; cf. </w:t>
+          <w:t>21:26</w:t>
+        </w:r>
+      </w:hyperlink>
+      <w:r>
+        <w:rPr>
+          <w:lang w:val="en_US" w:bidi="en_US"/>
+        </w:rPr>
+        <w:t xml:space="preserve">; compare </w:t>
       </w:r>
       <w:hyperlink r:id="rId76">
         <w:r>
@@ -2617,7 +2894,7 @@
         <w:rPr>
           <w:lang w:val="en_US" w:bidi="en_US"/>
         </w:rPr>
-        <w:t>Hezekiah destroyed the high places, broke down the pillars, and cut down the Asherim (</w:t>
+        <w:t>King Hezekiah “removed the high places, shattered the sacred pillars, and cut down the Asherah poles” (</w:t>
       </w:r>
       <w:hyperlink r:id="rId77">
         <w:r>
@@ -2628,7 +2905,7 @@
             <w:color w:val="0000EE"/>
             <w:u w:val="single"/>
           </w:rPr>
-          <w:t>2 Kgs 18:4</w:t>
+          <w:t>2 Kings 18:4</w:t>
         </w:r>
       </w:hyperlink>
       <w:r>
@@ -2646,14 +2923,14 @@
             <w:color w:val="0000EE"/>
             <w:u w:val="single"/>
           </w:rPr>
-          <w:t>2 Chr 31:1</w:t>
-        </w:r>
-      </w:hyperlink>
-      <w:r>
-        <w:rPr>
-          <w:lang w:val="en_US" w:bidi="en_US"/>
-        </w:rPr>
-        <w:t>). He also put an end to a strange cult that illustrates the insidious nature of idolatry. The bronze serpent that Moses lifted up on a pole to save the Israelites from death by snakebite (</w:t>
+          <w:t>2 Chronicles 31:1</w:t>
+        </w:r>
+      </w:hyperlink>
+      <w:r>
+        <w:rPr>
+          <w:lang w:val="en_US" w:bidi="en_US"/>
+        </w:rPr>
+        <w:t>). He also ended the worship of a bronze serpent. This example shows how an object that once had a good purpose can later become an idol. Moses had lifted up this bronze serpent on a pole so that Israelites who had been bitten by snakes could live (</w:t>
       </w:r>
       <w:hyperlink r:id="rId79">
         <w:r>
@@ -2664,14 +2941,14 @@
             <w:color w:val="0000EE"/>
             <w:u w:val="single"/>
           </w:rPr>
-          <w:t>Nm 21:9</w:t>
-        </w:r>
-      </w:hyperlink>
-      <w:r>
-        <w:rPr>
-          <w:lang w:val="en_US" w:bidi="en_US"/>
-        </w:rPr>
-        <w:t xml:space="preserve">; cf. </w:t>
+          <w:t>Numbers 21:9</w:t>
+        </w:r>
+      </w:hyperlink>
+      <w:r>
+        <w:rPr>
+          <w:lang w:val="en_US" w:bidi="en_US"/>
+        </w:rPr>
+        <w:t xml:space="preserve">; see also </w:t>
       </w:r>
       <w:hyperlink r:id="rId80">
         <w:r>
@@ -2682,14 +2959,28 @@
             <w:color w:val="0000EE"/>
             <w:u w:val="single"/>
           </w:rPr>
-          <w:t>Jn 3:14</w:t>
-        </w:r>
-      </w:hyperlink>
-      <w:r>
-        <w:rPr>
-          <w:lang w:val="en_US" w:bidi="en_US"/>
-        </w:rPr>
-        <w:t>) had been preserved until the time of Hezekiah. It had been given the name Nehushtan, and people venerated it and burned incense to it. Hezekiah destroyed it (</w:t>
+          <w:t>John 3:14</w:t>
+        </w:r>
+      </w:hyperlink>
+      <w:r>
+        <w:rPr>
+          <w:lang w:val="en_US" w:bidi="en_US"/>
+        </w:rPr>
+        <w:t xml:space="preserve">). </w:t>
+      </w:r>
+    </w:p>
+    <w:p>
+      <w:pPr/>
+      <w:r>
+        <w:rPr>
+          <w:lang w:val="en_US" w:bidi="en_US"/>
+        </w:rPr>
+      </w:r>
+      <w:r>
+        <w:rPr>
+          <w:lang w:val="en_US" w:bidi="en_US"/>
+        </w:rPr>
+        <w:t>The bronze serpent was kept until the time of Hezekiah. People called it Nehushtan, honored it as sacred, and burned incense to it. Hezekiah destroyed it because the people had begun to worship an object that had originally been used for good (</w:t>
       </w:r>
       <w:hyperlink r:id="rId77">
         <w:r>
@@ -2700,28 +2991,39 @@
             <w:color w:val="0000EE"/>
             <w:u w:val="single"/>
           </w:rPr>
-          <w:t>2 Kgs 18:4</w:t>
-        </w:r>
-      </w:hyperlink>
-      <w:r>
-        <w:rPr>
-          <w:lang w:val="en_US" w:bidi="en_US"/>
-        </w:rPr>
-        <w:t>) because what had been an instrument for good had become a thing of evil.</w:t>
-      </w:r>
-    </w:p>
-    <w:p>
-      <w:pPr/>
-      <w:r>
-        <w:rPr>
-          <w:lang w:val="en_US" w:bidi="en_US"/>
-        </w:rPr>
-      </w:r>
-      <w:r>
-        <w:rPr>
-          <w:lang w:val="en_US" w:bidi="en_US"/>
-        </w:rPr>
-        <w:t>The prophet Isaiah described the making of an idol in human form (</w:t>
+          <w:t>2 Kings 18:4</w:t>
+        </w:r>
+      </w:hyperlink>
+      <w:r>
+        <w:rPr>
+          <w:lang w:val="en_US" w:bidi="en_US"/>
+        </w:rPr>
+        <w:t>).</w:t>
+      </w:r>
+    </w:p>
+    <w:p>
+      <w:pPr>
+        <w:pStyle w:val="Heading4"/>
+      </w:pPr>
+      <w:r>
+        <w:rPr>
+          <w:lang w:val="en_US" w:bidi="en_US"/>
+        </w:rPr>
+        <w:t>How People Made Idols</w:t>
+      </w:r>
+    </w:p>
+    <w:p>
+      <w:pPr/>
+      <w:r>
+        <w:rPr>
+          <w:lang w:val="en_US" w:bidi="en_US"/>
+        </w:rPr>
+      </w:r>
+      <w:r>
+        <w:rPr>
+          <w:lang w:val="en_US" w:bidi="en_US"/>
+        </w:rPr>
+        <w:t>The prophet Isaiah described how people made idols in human form (</w:t>
       </w:r>
       <w:hyperlink r:id="rId81">
         <w:r>
@@ -2732,7 +3034,7 @@
             <w:color w:val="0000EE"/>
             <w:u w:val="single"/>
           </w:rPr>
-          <w:t>Is 40:19–20</w:t>
+          <w:t>Isaiah 40:19–20</w:t>
         </w:r>
       </w:hyperlink>
       <w:r>
@@ -2757,7 +3059,7 @@
         <w:rPr>
           <w:lang w:val="en_US" w:bidi="en_US"/>
         </w:rPr>
-        <w:t>). Images were cast in a mold using molten metal (</w:t>
+        <w:t>). They cast images in molds using melted metal (</w:t>
       </w:r>
       <w:hyperlink r:id="rId83">
         <w:r>
@@ -2793,7 +3095,7 @@
         <w:rPr>
           <w:lang w:val="en_US" w:bidi="en_US"/>
         </w:rPr>
-        <w:t>). Statues were forged by smiths (</w:t>
+        <w:t>). Blacksmiths forged statues from metal (</w:t>
       </w:r>
       <w:hyperlink r:id="rId85">
         <w:r>
@@ -2811,7 +3113,7 @@
         <w:rPr>
           <w:lang w:val="en_US" w:bidi="en_US"/>
         </w:rPr>
-        <w:t>), carved from wood (</w:t>
+        <w:t>). Carpenters carved them from wood (</w:t>
       </w:r>
       <w:hyperlink r:id="rId86">
         <w:r>
@@ -2829,7 +3131,7 @@
         <w:rPr>
           <w:lang w:val="en_US" w:bidi="en_US"/>
         </w:rPr>
-        <w:t>), and overlaid with precious metal (</w:t>
+        <w:t>). Workers then covered them with precious metal (</w:t>
       </w:r>
       <w:hyperlink r:id="rId83">
         <w:r>
@@ -2847,7 +3149,46 @@
         <w:rPr>
           <w:lang w:val="en_US" w:bidi="en_US"/>
         </w:rPr>
-        <w:t>). Small clay images and plaques were also molded and fired in a kiln, and statues were sculptured from stone. The psalmist spoke out against idols and images (</w:t>
+        <w:t xml:space="preserve">). </w:t>
+      </w:r>
+    </w:p>
+    <w:p>
+      <w:pPr/>
+      <w:r>
+        <w:rPr>
+          <w:lang w:val="en_US" w:bidi="en_US"/>
+        </w:rPr>
+      </w:r>
+      <w:r>
+        <w:rPr>
+          <w:lang w:val="en_US" w:bidi="en_US"/>
+        </w:rPr>
+        <w:t>People also made small clay images and plaques by shaping the clay and heating it in a kiln. Other statues were carved from stone.</w:t>
+      </w:r>
+    </w:p>
+    <w:p>
+      <w:pPr>
+        <w:pStyle w:val="Heading4"/>
+      </w:pPr>
+      <w:r>
+        <w:rPr>
+          <w:lang w:val="en_US" w:bidi="en_US"/>
+        </w:rPr>
+        <w:t xml:space="preserve">Idols in the Psalms and the Exile </w:t>
+      </w:r>
+    </w:p>
+    <w:p>
+      <w:pPr/>
+      <w:r>
+        <w:rPr>
+          <w:lang w:val="en_US" w:bidi="en_US"/>
+        </w:rPr>
+      </w:r>
+      <w:r>
+        <w:rPr>
+          <w:lang w:val="en_US" w:bidi="en_US"/>
+        </w:rPr>
+        <w:t>The book of Psalms also speaks against idols and images (</w:t>
       </w:r>
       <w:hyperlink r:id="rId87">
         <w:r>
@@ -2858,7 +3199,7 @@
             <w:color w:val="0000EE"/>
             <w:u w:val="single"/>
           </w:rPr>
-          <w:t>Pss 96:5</w:t>
+          <w:t>Psalms 96:5</w:t>
         </w:r>
       </w:hyperlink>
       <w:r>
@@ -2901,7 +3242,7 @@
         <w:rPr>
           <w:lang w:val="en_US" w:bidi="en_US"/>
         </w:rPr>
-        <w:t xml:space="preserve">) and the helplessness of idols is described in </w:t>
+        <w:t xml:space="preserve">). </w:t>
       </w:r>
       <w:hyperlink r:id="rId90">
         <w:r>
@@ -2937,6 +3278,153 @@
         <w:rPr>
           <w:lang w:val="en_US" w:bidi="en_US"/>
         </w:rPr>
+        <w:t xml:space="preserve"> describe idols as powerless and unable to help those who worship them.</w:t>
+      </w:r>
+    </w:p>
+    <w:p>
+      <w:pPr/>
+      <w:r>
+        <w:rPr>
+          <w:lang w:val="en_US" w:bidi="en_US"/>
+        </w:rPr>
+      </w:r>
+      <w:r>
+        <w:rPr>
+          <w:lang w:val="en_US" w:bidi="en_US"/>
+        </w:rPr>
+        <w:t>The northern and southern kingdoms of Israel were taken into exile because the people turned away from God and worshiped idols. The Jewish people understood that idolatry had contributed to their exile. During their time in Babylon, they developed a strong rejection of idol worship. This rejection of idolatry continued to be an important part of Judaism.</w:t>
+      </w:r>
+    </w:p>
+    <w:p>
+      <w:pPr>
+        <w:pStyle w:val="Heading3"/>
+      </w:pPr>
+      <w:r>
+        <w:rPr>
+          <w:lang w:val="en_US" w:bidi="en_US"/>
+        </w:rPr>
+        <w:t>Idols and Idolatry in the New Testament</w:t>
+      </w:r>
+    </w:p>
+    <w:p>
+      <w:pPr/>
+      <w:r>
+        <w:rPr>
+          <w:lang w:val="en_US" w:bidi="en_US"/>
+        </w:rPr>
+      </w:r>
+      <w:r>
+        <w:rPr>
+          <w:lang w:val="en_US" w:bidi="en_US"/>
+        </w:rPr>
+        <w:t xml:space="preserve">The New Testament gives its fullest discussion of idolatry in Paul’s First Letter to the Corinthians. The Greek word for idolatry is </w:t>
+      </w:r>
+      <w:r>
+        <w:rPr>
+          <w:i/>
+          <w:lang w:val="en_US" w:bidi="en_US"/>
+        </w:rPr>
+        <w:t>eidololatreia</w:t>
+      </w:r>
+      <w:r>
+        <w:rPr>
+          <w:lang w:val="en_US" w:bidi="en_US"/>
+        </w:rPr>
+        <w:t xml:space="preserve">, and the word for an idol worshiper is </w:t>
+      </w:r>
+      <w:r>
+        <w:rPr>
+          <w:i/>
+          <w:lang w:val="en_US" w:bidi="en_US"/>
+        </w:rPr>
+        <w:t>eidololatres</w:t>
+      </w:r>
+      <w:r>
+        <w:rPr>
+          <w:lang w:val="en_US" w:bidi="en_US"/>
+        </w:rPr>
+        <w:t xml:space="preserve">. </w:t>
+      </w:r>
+    </w:p>
+    <w:p>
+      <w:pPr/>
+      <w:r>
+        <w:rPr>
+          <w:lang w:val="en_US" w:bidi="en_US"/>
+        </w:rPr>
+      </w:r>
+      <w:r>
+        <w:rPr>
+          <w:lang w:val="en_US" w:bidi="en_US"/>
+        </w:rPr>
+        <w:t>In an earlier letter that has not survived, Paul told the Corinthians not to associate with people who claimed to be believers but still worshiped idols (</w:t>
+      </w:r>
+      <w:hyperlink r:id="rId92">
+        <w:r>
+          <w:rPr>
+            <w:lang w:val="en_US" w:bidi="en_US"/>
+          </w:rPr>
+          <w:rPr>
+            <w:color w:val="0000EE"/>
+            <w:u w:val="single"/>
+          </w:rPr>
+          <w:t>1 Corinthians 5:9–11</w:t>
+        </w:r>
+      </w:hyperlink>
+      <w:r>
+        <w:rPr>
+          <w:lang w:val="en_US" w:bidi="en_US"/>
+        </w:rPr>
+        <w:t xml:space="preserve">). </w:t>
+      </w:r>
+    </w:p>
+    <w:p>
+      <w:pPr/>
+      <w:r>
+        <w:rPr>
+          <w:lang w:val="en_US" w:bidi="en_US"/>
+        </w:rPr>
+      </w:r>
+      <w:r>
+        <w:rPr>
+          <w:lang w:val="en_US" w:bidi="en_US"/>
+        </w:rPr>
+        <w:t xml:space="preserve">After receiving that letter, the Corinthians may have asked Paul for more explanation. In 1 Corinthians, Paul then speaks again about “idolaters” in </w:t>
+      </w:r>
+      <w:hyperlink r:id="rId93">
+        <w:r>
+          <w:rPr>
+            <w:lang w:val="en_US" w:bidi="en_US"/>
+          </w:rPr>
+          <w:rPr>
+            <w:color w:val="0000EE"/>
+            <w:u w:val="single"/>
+          </w:rPr>
+          <w:t>5:10–11, 6:9, 10:7</w:t>
+        </w:r>
+      </w:hyperlink>
+      <w:r>
+        <w:rPr>
+          <w:lang w:val="en_US" w:bidi="en_US"/>
+        </w:rPr>
+        <w:t xml:space="preserve">, and “idolatry” in </w:t>
+      </w:r>
+      <w:hyperlink r:id="rId94">
+        <w:r>
+          <w:rPr>
+            <w:lang w:val="en_US" w:bidi="en_US"/>
+          </w:rPr>
+          <w:rPr>
+            <w:color w:val="0000EE"/>
+            <w:u w:val="single"/>
+          </w:rPr>
+          <w:t>10:14</w:t>
+        </w:r>
+      </w:hyperlink>
+      <w:r>
+        <w:rPr>
+          <w:lang w:val="en_US" w:bidi="en_US"/>
+        </w:rPr>
         <w:t>.</w:t>
       </w:r>
     </w:p>
@@ -2951,643 +3439,640 @@
         <w:rPr>
           <w:lang w:val="en_US" w:bidi="en_US"/>
         </w:rPr>
-        <w:t>The northern and southern kingdoms of Israel went into captivity because they forsook God and served idols. The Jews were well aware that idolatry had brought them into captivity, and during their time in Babylon, they developed an abhorrence to idols that has characterized Judaism to this very day.</w:t>
-      </w:r>
-    </w:p>
-    <w:p>
-      <w:pPr>
-        <w:pStyle w:val="Heading3"/>
-      </w:pPr>
-      <w:r>
-        <w:rPr>
-          <w:lang w:val="en_US" w:bidi="en_US"/>
-        </w:rPr>
-        <w:t>In the New Testament</w:t>
-      </w:r>
-    </w:p>
-    <w:p>
-      <w:pPr/>
-      <w:r>
-        <w:rPr>
-          <w:lang w:val="en_US" w:bidi="en_US"/>
-        </w:rPr>
-      </w:r>
-      <w:r>
-        <w:rPr>
-          <w:lang w:val="en_US" w:bidi="en_US"/>
-        </w:rPr>
-        <w:t xml:space="preserve">The fullest discussion in the NT on idolatry </w:t>
+        <w:t xml:space="preserve">The words “idolatry” and “idolater” are related to two other Greek terms. The first is </w:t>
       </w:r>
       <w:r>
         <w:rPr>
           <w:i/>
           <w:lang w:val="en_US" w:bidi="en_US"/>
         </w:rPr>
-        <w:t>(</w:t>
-      </w:r>
-      <w:r>
-        <w:rPr>
-          <w:lang w:val="en_US" w:bidi="en_US"/>
-        </w:rPr>
-        <w:t>eidololatreia</w:t>
+        <w:t>eidolon</w:t>
+      </w:r>
+      <w:r>
+        <w:rPr>
+          <w:lang w:val="en_US" w:bidi="en_US"/>
+        </w:rPr>
+        <w:t>, meaning “idol” (</w:t>
+      </w:r>
+      <w:hyperlink r:id="rId95">
+        <w:r>
+          <w:rPr>
+            <w:lang w:val="en_US" w:bidi="en_US"/>
+          </w:rPr>
+          <w:rPr>
+            <w:color w:val="0000EE"/>
+            <w:u w:val="single"/>
+          </w:rPr>
+          <w:t>1 Corinthians 8:4</w:t>
+        </w:r>
+      </w:hyperlink>
+      <w:r>
+        <w:rPr>
+          <w:lang w:val="en_US" w:bidi="en_US"/>
+        </w:rPr>
+        <w:t xml:space="preserve">; </w:t>
+      </w:r>
+      <w:hyperlink r:id="rId96">
+        <w:r>
+          <w:rPr>
+            <w:lang w:val="en_US" w:bidi="en_US"/>
+          </w:rPr>
+          <w:rPr>
+            <w:color w:val="0000EE"/>
+            <w:u w:val="single"/>
+          </w:rPr>
+          <w:t>10:19</w:t>
+        </w:r>
+      </w:hyperlink>
+      <w:r>
+        <w:rPr>
+          <w:lang w:val="en_US" w:bidi="en_US"/>
+        </w:rPr>
+        <w:t xml:space="preserve">; </w:t>
+      </w:r>
+      <w:hyperlink r:id="rId97">
+        <w:r>
+          <w:rPr>
+            <w:lang w:val="en_US" w:bidi="en_US"/>
+          </w:rPr>
+          <w:rPr>
+            <w:color w:val="0000EE"/>
+            <w:u w:val="single"/>
+          </w:rPr>
+          <w:t>12:2</w:t>
+        </w:r>
+      </w:hyperlink>
+      <w:r>
+        <w:rPr>
+          <w:lang w:val="en_US" w:bidi="en_US"/>
+        </w:rPr>
+        <w:t xml:space="preserve">). The second is </w:t>
       </w:r>
       <w:r>
         <w:rPr>
           <w:i/>
           <w:lang w:val="en_US" w:bidi="en_US"/>
         </w:rPr>
-        <w:t>)</w:t>
-      </w:r>
-      <w:r>
-        <w:rPr>
-          <w:lang w:val="en_US" w:bidi="en_US"/>
-        </w:rPr>
-        <w:t xml:space="preserve"> and the idolworshiper </w:t>
+        <w:t>eidolothutos</w:t>
+      </w:r>
+      <w:r>
+        <w:rPr>
+          <w:lang w:val="en_US" w:bidi="en_US"/>
+        </w:rPr>
+        <w:t>, meaning “food sacrificed to idols” (</w:t>
+      </w:r>
+      <w:hyperlink r:id="rId98">
+        <w:r>
+          <w:rPr>
+            <w:lang w:val="en_US" w:bidi="en_US"/>
+          </w:rPr>
+          <w:rPr>
+            <w:color w:val="0000EE"/>
+            <w:u w:val="single"/>
+          </w:rPr>
+          <w:t>1 Corinthians 8:1, 4, 7</w:t>
+        </w:r>
+      </w:hyperlink>
+      <w:r>
+        <w:rPr>
+          <w:lang w:val="en_US" w:bidi="en_US"/>
+        </w:rPr>
+        <w:t xml:space="preserve">; </w:t>
+      </w:r>
+      <w:hyperlink r:id="rId96">
+        <w:r>
+          <w:rPr>
+            <w:lang w:val="en_US" w:bidi="en_US"/>
+          </w:rPr>
+          <w:rPr>
+            <w:color w:val="0000EE"/>
+            <w:u w:val="single"/>
+          </w:rPr>
+          <w:t>10:19</w:t>
+        </w:r>
+      </w:hyperlink>
+      <w:r>
+        <w:rPr>
+          <w:lang w:val="en_US" w:bidi="en_US"/>
+        </w:rPr>
+        <w:t xml:space="preserve">). </w:t>
+      </w:r>
+    </w:p>
+    <w:p>
+      <w:pPr>
+        <w:pStyle w:val="Heading4"/>
+      </w:pPr>
+      <w:r>
+        <w:rPr>
+          <w:lang w:val="en_US" w:bidi="en_US"/>
+        </w:rPr>
+        <w:t>Food Sacrificed to Idols</w:t>
+      </w:r>
+    </w:p>
+    <w:p>
+      <w:pPr/>
+      <w:r>
+        <w:rPr>
+          <w:lang w:val="en_US" w:bidi="en_US"/>
+        </w:rPr>
+      </w:r>
+      <w:r>
+        <w:rPr>
+          <w:lang w:val="en_US" w:bidi="en_US"/>
+        </w:rPr>
+        <w:t>Paul strongly condemns Christians who take part in sacrifices to idols and then eat the food offered in those sacrifices. He calls such people idol worshipers because taking part in these sacrifices meant sharing in fellowship with demons.</w:t>
+      </w:r>
+    </w:p>
+    <w:p>
+      <w:pPr/>
+      <w:r>
+        <w:rPr>
+          <w:lang w:val="en_US" w:bidi="en_US"/>
+        </w:rPr>
+      </w:r>
+      <w:r>
+        <w:rPr>
+          <w:lang w:val="en_US" w:bidi="en_US"/>
+        </w:rPr>
+        <w:t>Paul therefore forbids Christians to eat sacrificial food in pagan temples where idols were worshiped. In this way, his view was similar to that of many Jews of his time. They connected pagan gods with idols. Paul also contrasts idols with “the living and true God” (</w:t>
+      </w:r>
+      <w:hyperlink r:id="rId99">
+        <w:r>
+          <w:rPr>
+            <w:lang w:val="en_US" w:bidi="en_US"/>
+          </w:rPr>
+          <w:rPr>
+            <w:color w:val="0000EE"/>
+            <w:u w:val="single"/>
+          </w:rPr>
+          <w:t>1 Thessalonians 1:9</w:t>
+        </w:r>
+      </w:hyperlink>
+      <w:r>
+        <w:rPr>
+          <w:lang w:val="en_US" w:bidi="en_US"/>
+        </w:rPr>
+        <w:t>).</w:t>
+      </w:r>
+    </w:p>
+    <w:p>
+      <w:pPr/>
+      <w:r>
+        <w:rPr>
+          <w:lang w:val="en_US" w:bidi="en_US"/>
+        </w:rPr>
+      </w:r>
+      <w:r>
+        <w:rPr>
+          <w:lang w:val="en_US" w:bidi="en_US"/>
+        </w:rPr>
+        <w:t>At the same time, Paul says that an idol has no real power in itself (</w:t>
+      </w:r>
+      <w:hyperlink r:id="rId95">
+        <w:r>
+          <w:rPr>
+            <w:lang w:val="en_US" w:bidi="en_US"/>
+          </w:rPr>
+          <w:rPr>
+            <w:color w:val="0000EE"/>
+            <w:u w:val="single"/>
+          </w:rPr>
+          <w:t>1 Corinthians 8:4</w:t>
+        </w:r>
+      </w:hyperlink>
+      <w:r>
+        <w:rPr>
+          <w:lang w:val="en_US" w:bidi="en_US"/>
+        </w:rPr>
+        <w:t>). However, he also teaches that demons are connected with sacrifices offered to idols (</w:t>
+      </w:r>
+      <w:hyperlink r:id="rId100">
+        <w:r>
+          <w:rPr>
+            <w:lang w:val="en_US" w:bidi="en_US"/>
+          </w:rPr>
+          <w:rPr>
+            <w:color w:val="0000EE"/>
+            <w:u w:val="single"/>
+          </w:rPr>
+          <w:t>10:20</w:t>
+        </w:r>
+      </w:hyperlink>
+      <w:r>
+        <w:rPr>
+          <w:lang w:val="en_US" w:bidi="en_US"/>
+        </w:rPr>
+        <w:t>).</w:t>
+      </w:r>
+    </w:p>
+    <w:p>
+      <w:pPr/>
+      <w:r>
+        <w:rPr>
+          <w:lang w:val="en_US" w:bidi="en_US"/>
+        </w:rPr>
+      </w:r>
+      <w:r>
+        <w:rPr>
+          <w:lang w:val="en_US" w:bidi="en_US"/>
+        </w:rPr>
+        <w:t xml:space="preserve">Paul did not allow Christians to take part in meals connected with idol worship in pagan temples. He taught that those who joined these meals were sharing in fellowship with demons (see </w:t>
+      </w:r>
+      <w:hyperlink r:id="rId101">
+        <w:r>
+          <w:rPr>
+            <w:lang w:val="en_US" w:bidi="en_US"/>
+          </w:rPr>
+          <w:rPr>
+            <w:color w:val="0000EE"/>
+            <w:u w:val="single"/>
+          </w:rPr>
+          <w:t>1 Corinthians 10:19–21</w:t>
+        </w:r>
+      </w:hyperlink>
+      <w:r>
+        <w:rPr>
+          <w:lang w:val="en_US" w:bidi="en_US"/>
+        </w:rPr>
+        <w:t xml:space="preserve">). </w:t>
+      </w:r>
+    </w:p>
+    <w:p>
+      <w:pPr/>
+      <w:r>
+        <w:rPr>
+          <w:lang w:val="en_US" w:bidi="en_US"/>
+        </w:rPr>
+      </w:r>
+      <w:r>
+        <w:rPr>
+          <w:lang w:val="en_US" w:bidi="en_US"/>
+        </w:rPr>
+        <w:t>However, Paul allowed Christians to buy and eat food that had first been offered to idols and was later sold in the marketplace. If they ate this food at home, they were not taking part in idol worship.</w:t>
+      </w:r>
+    </w:p>
+    <w:p>
+      <w:pPr/>
+      <w:r>
+        <w:rPr>
+          <w:lang w:val="en_US" w:bidi="en_US"/>
+        </w:rPr>
+      </w:r>
+      <w:r>
+        <w:rPr>
+          <w:lang w:val="en_US" w:bidi="en_US"/>
+        </w:rPr>
+        <w:t>They could eat it with a clear conscience unless doing so would harm the faith of another believer. In that case, they should choose not to eat it for the sake of the weaker believer. Paul treated this as a matter of conscience (</w:t>
+      </w:r>
+      <w:hyperlink r:id="rId102">
+        <w:r>
+          <w:rPr>
+            <w:lang w:val="en_US" w:bidi="en_US"/>
+          </w:rPr>
+          <w:rPr>
+            <w:color w:val="0000EE"/>
+            <w:u w:val="single"/>
+          </w:rPr>
+          <w:t>1 Corinthians 10:25–29</w:t>
+        </w:r>
+      </w:hyperlink>
+      <w:r>
+        <w:rPr>
+          <w:lang w:val="en_US" w:bidi="en_US"/>
+        </w:rPr>
+        <w:t>). But taking part in pagan festivals and eating meals offered to idols as part of worship was not permitted.</w:t>
+      </w:r>
+    </w:p>
+    <w:p>
+      <w:pPr>
+        <w:pStyle w:val="Heading4"/>
+      </w:pPr>
+      <w:r>
+        <w:rPr>
+          <w:lang w:val="en_US" w:bidi="en_US"/>
+        </w:rPr>
+        <w:t>Meals at Corinth</w:t>
+      </w:r>
+    </w:p>
+    <w:p>
+      <w:pPr/>
+      <w:r>
+        <w:rPr>
+          <w:lang w:val="en_US" w:bidi="en_US"/>
+        </w:rPr>
+      </w:r>
+      <w:r>
+        <w:rPr>
+          <w:lang w:val="en_US" w:bidi="en_US"/>
+        </w:rPr>
+        <w:t>Before becoming Christians, the Corinthians regularly took part in meals connected with pagan worship. Some of them seem to have continued this practice after becoming Christians.</w:t>
+      </w:r>
+    </w:p>
+    <w:p>
+      <w:pPr/>
+      <w:r>
+        <w:rPr>
+          <w:lang w:val="en_US" w:bidi="en_US"/>
+        </w:rPr>
+      </w:r>
+      <w:r>
+        <w:rPr>
+          <w:lang w:val="en_US" w:bidi="en_US"/>
+        </w:rPr>
+        <w:t>In Corinth, these meals were common at public festivals and private celebrations. People believed that these gods were present because sacrifices had been offered to them. Paul understood these “gods” as “demons.” Therefore, he taught that taking part in these meals joined a person with demons and made that person an idol worshiper.</w:t>
+      </w:r>
+    </w:p>
+    <w:p>
+      <w:pPr/>
+      <w:r>
+        <w:rPr>
+          <w:lang w:val="en_US" w:bidi="en_US"/>
+        </w:rPr>
+      </w:r>
+      <w:r>
+        <w:rPr>
+          <w:lang w:val="en_US" w:bidi="en_US"/>
+        </w:rPr>
+        <w:t xml:space="preserve">Paul also pointed to the history of Israel as a warning. On several occasions, the Israelites were drawn into idolatry by joining the religious celebrations of neighboring peoples (for example, </w:t>
+      </w:r>
+      <w:hyperlink r:id="rId103">
+        <w:r>
+          <w:rPr>
+            <w:lang w:val="en_US" w:bidi="en_US"/>
+          </w:rPr>
+          <w:rPr>
+            <w:color w:val="0000EE"/>
+            <w:u w:val="single"/>
+          </w:rPr>
+          <w:t>Numbers 25</w:t>
+        </w:r>
+      </w:hyperlink>
+      <w:r>
+        <w:rPr>
+          <w:lang w:val="en_US" w:bidi="en_US"/>
+        </w:rPr>
+        <w:t xml:space="preserve">; compare </w:t>
+      </w:r>
+      <w:hyperlink r:id="rId104">
+        <w:r>
+          <w:rPr>
+            <w:lang w:val="en_US" w:bidi="en_US"/>
+          </w:rPr>
+          <w:rPr>
+            <w:color w:val="0000EE"/>
+            <w:u w:val="single"/>
+          </w:rPr>
+          <w:t>Exodus 32:6</w:t>
+        </w:r>
+      </w:hyperlink>
+      <w:r>
+        <w:rPr>
+          <w:lang w:val="en_US" w:bidi="en_US"/>
+        </w:rPr>
+        <w:t>). These celebrations also involved sexual immorality.</w:t>
+      </w:r>
+    </w:p>
+    <w:p>
+      <w:pPr/>
+      <w:r>
+        <w:rPr>
+          <w:lang w:val="en_US" w:bidi="en_US"/>
+        </w:rPr>
+      </w:r>
+      <w:r>
+        <w:rPr>
+          <w:lang w:val="en_US" w:bidi="en_US"/>
+        </w:rPr>
+        <w:t xml:space="preserve">In </w:t>
+      </w:r>
+      <w:hyperlink r:id="rId105">
+        <w:r>
+          <w:rPr>
+            <w:lang w:val="en_US" w:bidi="en_US"/>
+          </w:rPr>
+          <w:rPr>
+            <w:color w:val="0000EE"/>
+            <w:u w:val="single"/>
+          </w:rPr>
+          <w:t>1 Corinthians 10</w:t>
+        </w:r>
+      </w:hyperlink>
+      <w:r>
+        <w:rPr>
+          <w:lang w:val="en_US" w:bidi="en_US"/>
+        </w:rPr>
+        <w:t>, Paul uses Israel’s unfaithfulness as a negative example. By taking part in pagan celebrations, the Israelites were led into idolatry and sexual immorality. This brought God’s judgment and destruction on them.</w:t>
+      </w:r>
+    </w:p>
+    <w:p>
+      <w:pPr>
+        <w:pStyle w:val="Heading4"/>
+      </w:pPr>
+      <w:r>
+        <w:rPr>
+          <w:lang w:val="en_US" w:bidi="en_US"/>
+        </w:rPr>
+        <w:t>Idolatry in Paul's Other Letters</w:t>
+      </w:r>
+    </w:p>
+    <w:p>
+      <w:pPr/>
+      <w:r>
+        <w:rPr>
+          <w:lang w:val="en_US" w:bidi="en_US"/>
+        </w:rPr>
+      </w:r>
+      <w:r>
+        <w:rPr>
+          <w:lang w:val="en_US" w:bidi="en_US"/>
+        </w:rPr>
+        <w:t>In Paul’s other letters, he mentions idolatry but does not explain it as fully as he does in 1 Corinthians. Paul speaks against both direct idol worship and what may be called figurative idolatry. Figurative idolatry means desiring or valuing something more than God.</w:t>
+      </w:r>
+    </w:p>
+    <w:p>
+      <w:pPr/>
+      <w:r>
+        <w:rPr>
+          <w:lang w:val="en_US" w:bidi="en_US"/>
+        </w:rPr>
+      </w:r>
+      <w:r>
+        <w:rPr>
+          <w:lang w:val="en_US" w:bidi="en_US"/>
+        </w:rPr>
+        <w:t xml:space="preserve">In </w:t>
+      </w:r>
+      <w:hyperlink r:id="rId106">
+        <w:r>
+          <w:rPr>
+            <w:lang w:val="en_US" w:bidi="en_US"/>
+          </w:rPr>
+          <w:rPr>
+            <w:color w:val="0000EE"/>
+            <w:u w:val="single"/>
+          </w:rPr>
+          <w:t>Romans 1:18–32</w:t>
+        </w:r>
+      </w:hyperlink>
+      <w:r>
+        <w:rPr>
+          <w:lang w:val="en_US" w:bidi="en_US"/>
+        </w:rPr>
+        <w:t>, Paul connects sexual immorality and other sins with idolatry. He says that the Gentiles should have recognized God through what he created. Instead, they turned away from the immortal and invisible God and worshiped mortal, visible images. Because they rejected God, Paul says that God gave them over to follow the sinful desires of their hearts (</w:t>
+      </w:r>
+      <w:hyperlink r:id="rId107">
+        <w:r>
+          <w:rPr>
+            <w:lang w:val="en_US" w:bidi="en_US"/>
+          </w:rPr>
+          <w:rPr>
+            <w:color w:val="0000EE"/>
+            <w:u w:val="single"/>
+          </w:rPr>
+          <w:t>Romans 1:24</w:t>
+        </w:r>
+      </w:hyperlink>
+      <w:r>
+        <w:rPr>
+          <w:lang w:val="en_US" w:bidi="en_US"/>
+        </w:rPr>
+        <w:t xml:space="preserve">). </w:t>
+      </w:r>
+    </w:p>
+    <w:p>
+      <w:pPr/>
+      <w:r>
+        <w:rPr>
+          <w:lang w:val="en_US" w:bidi="en_US"/>
+        </w:rPr>
+      </w:r>
+      <w:r>
+        <w:rPr>
+          <w:lang w:val="en_US" w:bidi="en_US"/>
+        </w:rPr>
+        <w:t xml:space="preserve">Paul also includes idolatry among the “acts of the flesh,” meaning sinful actions that come from human desires opposed to God (see </w:t>
+      </w:r>
+      <w:hyperlink r:id="rId108">
+        <w:r>
+          <w:rPr>
+            <w:lang w:val="en_US" w:bidi="en_US"/>
+          </w:rPr>
+          <w:rPr>
+            <w:color w:val="0000EE"/>
+            <w:u w:val="single"/>
+          </w:rPr>
+          <w:t>Galatians 5:19–20</w:t>
+        </w:r>
+      </w:hyperlink>
+      <w:r>
+        <w:rPr>
+          <w:lang w:val="en_US" w:bidi="en_US"/>
+        </w:rPr>
+        <w:t xml:space="preserve">). He also says that idol worshipers are among those who will not inherit the kingdom of God (see </w:t>
+      </w:r>
+      <w:hyperlink r:id="rId109">
+        <w:r>
+          <w:rPr>
+            <w:lang w:val="en_US" w:bidi="en_US"/>
+          </w:rPr>
+          <w:rPr>
+            <w:color w:val="0000EE"/>
+            <w:u w:val="single"/>
+          </w:rPr>
+          <w:t>1 Corinthians 6:9</w:t>
+        </w:r>
+      </w:hyperlink>
+      <w:r>
+        <w:rPr>
+          <w:lang w:val="en_US" w:bidi="en_US"/>
+        </w:rPr>
+        <w:t>).</w:t>
+      </w:r>
+    </w:p>
+    <w:p>
+      <w:pPr/>
+      <w:r>
+        <w:rPr>
+          <w:lang w:val="en_US" w:bidi="en_US"/>
+        </w:rPr>
+      </w:r>
+      <w:r>
+        <w:rPr>
+          <w:lang w:val="en_US" w:bidi="en_US"/>
+        </w:rPr>
+        <w:t xml:space="preserve">In </w:t>
+      </w:r>
+      <w:hyperlink r:id="rId110">
+        <w:r>
+          <w:rPr>
+            <w:lang w:val="en_US" w:bidi="en_US"/>
+          </w:rPr>
+          <w:rPr>
+            <w:color w:val="0000EE"/>
+            <w:u w:val="single"/>
+          </w:rPr>
+          <w:t>Ephesians 5:5</w:t>
+        </w:r>
+      </w:hyperlink>
+      <w:r>
+        <w:rPr>
+          <w:lang w:val="en_US" w:bidi="en_US"/>
+        </w:rPr>
+        <w:t>, Paul again says that idol worshipers will not inherit the kingdom of Christ and of God. In this passage, however, idolatry includes more than worshiping idols in pagan temples. Paul also connects idolatry with greed.</w:t>
+      </w:r>
+    </w:p>
+    <w:p>
+      <w:pPr/>
+      <w:r>
+        <w:rPr>
+          <w:lang w:val="en_US" w:bidi="en_US"/>
+        </w:rPr>
+      </w:r>
+      <w:r>
+        <w:rPr>
+          <w:lang w:val="en_US" w:bidi="en_US"/>
+        </w:rPr>
+        <w:t>The verse describes a greedy person as an idol worshiper. The idea seems to be that a greedy person gives their desires the place that belongs to God. In this sense, greed becomes a form of idolatry.</w:t>
+      </w:r>
+    </w:p>
+    <w:p>
+      <w:pPr/>
+      <w:r>
+        <w:rPr>
+          <w:lang w:val="en_US" w:bidi="en_US"/>
+        </w:rPr>
+      </w:r>
+      <w:hyperlink r:id="rId111">
+        <w:r>
+          <w:rPr>
+            <w:lang w:val="en_US" w:bidi="en_US"/>
+          </w:rPr>
+          <w:rPr>
+            <w:color w:val="0000EE"/>
+            <w:u w:val="single"/>
+          </w:rPr>
+          <w:t>Colossians 3:5</w:t>
+        </w:r>
+      </w:hyperlink>
+      <w:r>
+        <w:rPr>
+          <w:lang w:val="en_US" w:bidi="en_US"/>
+        </w:rPr>
+        <w:t xml:space="preserve"> makes this connection even more directly by saying that greed is idolatry.</w:t>
+      </w:r>
+    </w:p>
+    <w:p>
+      <w:pPr/>
+      <w:r>
+        <w:rPr>
+          <w:lang w:val="en_US" w:bidi="en_US"/>
+        </w:rPr>
       </w:r>
       <w:r>
         <w:rPr>
           <w:i/>
           <w:lang w:val="en_US" w:bidi="en_US"/>
         </w:rPr>
-        <w:t>(</w:t>
-      </w:r>
-      <w:r>
-        <w:rPr>
-          <w:lang w:val="en_US" w:bidi="en_US"/>
-        </w:rPr>
-        <w:t>eidololatres</w:t>
-      </w:r>
-      <w:r>
-        <w:rPr>
-          <w:i/>
-          <w:lang w:val="en_US" w:bidi="en_US"/>
-        </w:rPr>
-        <w:t>)</w:t>
-      </w:r>
-      <w:r>
-        <w:rPr>
-          <w:lang w:val="en_US" w:bidi="en_US"/>
-        </w:rPr>
-        <w:t xml:space="preserve"> is found in Paul’s First Epistle to the Corinthians. In an earlier (no longer extant) epistle, Paul had told the Corinthians not to associate with those who called themselves believers but were still idol worshipers (</w:t>
-      </w:r>
-      <w:hyperlink r:id="rId92">
-        <w:r>
-          <w:rPr>
-            <w:lang w:val="en_US" w:bidi="en_US"/>
-          </w:rPr>
-          <w:rPr>
-            <w:color w:val="0000EE"/>
-            <w:u w:val="single"/>
-          </w:rPr>
-          <w:t>1 Cor 5:9–11</w:t>
-        </w:r>
-      </w:hyperlink>
-      <w:r>
-        <w:rPr>
-          <w:lang w:val="en_US" w:bidi="en_US"/>
-        </w:rPr>
-        <w:t xml:space="preserve">). After that letter the Corinthians must have asked Paul for clarification on this matter. Thus, in this epistle Paul provides a response to their question; the “idol worshiper” is mentioned in </w:t>
-      </w:r>
-      <w:hyperlink r:id="rId93">
-        <w:r>
-          <w:rPr>
-            <w:lang w:val="en_US" w:bidi="en_US"/>
-          </w:rPr>
-          <w:rPr>
-            <w:color w:val="0000EE"/>
-            <w:u w:val="single"/>
-          </w:rPr>
-          <w:t>5:10–11, 6:9, 10:7</w:t>
-        </w:r>
-      </w:hyperlink>
-      <w:r>
-        <w:rPr>
-          <w:lang w:val="en_US" w:bidi="en_US"/>
-        </w:rPr>
-        <w:t xml:space="preserve">, and “idolatry” is spoken of in </w:t>
-      </w:r>
-      <w:hyperlink r:id="rId94">
-        <w:r>
-          <w:rPr>
-            <w:lang w:val="en_US" w:bidi="en_US"/>
-          </w:rPr>
-          <w:rPr>
-            <w:color w:val="0000EE"/>
-            <w:u w:val="single"/>
-          </w:rPr>
-          <w:t>10:14</w:t>
-        </w:r>
-      </w:hyperlink>
-      <w:r>
-        <w:rPr>
-          <w:lang w:val="en_US" w:bidi="en_US"/>
-        </w:rPr>
-        <w:t>.</w:t>
-      </w:r>
-    </w:p>
-    <w:p>
-      <w:pPr/>
-      <w:r>
-        <w:rPr>
-          <w:lang w:val="en_US" w:bidi="en_US"/>
-        </w:rPr>
-      </w:r>
-      <w:r>
-        <w:rPr>
-          <w:lang w:val="en_US" w:bidi="en_US"/>
-        </w:rPr>
-        <w:t xml:space="preserve">The terms, “idolatry” and “idol worshiper,” are related to two other expressions: (1) “idol” </w:t>
-      </w:r>
-      <w:r>
-        <w:rPr>
-          <w:i/>
-          <w:lang w:val="en_US" w:bidi="en_US"/>
-        </w:rPr>
-        <w:t>(</w:t>
-      </w:r>
-      <w:r>
-        <w:rPr>
-          <w:lang w:val="en_US" w:bidi="en_US"/>
-        </w:rPr>
-        <w:t>eidolon</w:t>
-      </w:r>
-      <w:r>
-        <w:rPr>
-          <w:i/>
-          <w:lang w:val="en_US" w:bidi="en_US"/>
-        </w:rPr>
-        <w:t>),</w:t>
-      </w:r>
-      <w:r>
-        <w:rPr>
-          <w:lang w:val="en_US" w:bidi="en_US"/>
-        </w:rPr>
-        <w:t xml:space="preserve"> found in </w:t>
-      </w:r>
-      <w:hyperlink r:id="rId95">
-        <w:r>
-          <w:rPr>
-            <w:lang w:val="en_US" w:bidi="en_US"/>
-          </w:rPr>
-          <w:rPr>
-            <w:color w:val="0000EE"/>
-            <w:u w:val="single"/>
-          </w:rPr>
-          <w:t>1 Corinthians 8:4</w:t>
-        </w:r>
-      </w:hyperlink>
-      <w:r>
-        <w:rPr>
-          <w:lang w:val="en_US" w:bidi="en_US"/>
-        </w:rPr>
-        <w:t xml:space="preserve">; </w:t>
-      </w:r>
-      <w:hyperlink r:id="rId96">
-        <w:r>
-          <w:rPr>
-            <w:lang w:val="en_US" w:bidi="en_US"/>
-          </w:rPr>
-          <w:rPr>
-            <w:color w:val="0000EE"/>
-            <w:u w:val="single"/>
-          </w:rPr>
-          <w:t>10:19</w:t>
-        </w:r>
-      </w:hyperlink>
-      <w:r>
-        <w:rPr>
-          <w:lang w:val="en_US" w:bidi="en_US"/>
-        </w:rPr>
-        <w:t xml:space="preserve">; </w:t>
-      </w:r>
-      <w:hyperlink r:id="rId97">
-        <w:r>
-          <w:rPr>
-            <w:lang w:val="en_US" w:bidi="en_US"/>
-          </w:rPr>
-          <w:rPr>
-            <w:color w:val="0000EE"/>
-            <w:u w:val="single"/>
-          </w:rPr>
-          <w:t>12:2</w:t>
-        </w:r>
-      </w:hyperlink>
-      <w:r>
-        <w:rPr>
-          <w:lang w:val="en_US" w:bidi="en_US"/>
-        </w:rPr>
-        <w:t xml:space="preserve">; and (2) “food sacrificed to idols” </w:t>
-      </w:r>
-      <w:r>
-        <w:rPr>
-          <w:i/>
-          <w:lang w:val="en_US" w:bidi="en_US"/>
-        </w:rPr>
-        <w:t>(</w:t>
-      </w:r>
-      <w:r>
-        <w:rPr>
-          <w:lang w:val="en_US" w:bidi="en_US"/>
-        </w:rPr>
-        <w:t>eidolothutos</w:t>
-      </w:r>
-      <w:r>
-        <w:rPr>
-          <w:i/>
-          <w:lang w:val="en_US" w:bidi="en_US"/>
-        </w:rPr>
-        <w:t>),</w:t>
-      </w:r>
-      <w:r>
-        <w:rPr>
-          <w:lang w:val="en_US" w:bidi="en_US"/>
-        </w:rPr>
-        <w:t xml:space="preserve"> found in </w:t>
-      </w:r>
-      <w:hyperlink r:id="rId98">
-        <w:r>
-          <w:rPr>
-            <w:lang w:val="en_US" w:bidi="en_US"/>
-          </w:rPr>
-          <w:rPr>
-            <w:color w:val="0000EE"/>
-            <w:u w:val="single"/>
-          </w:rPr>
-          <w:t>1 Corinthians 8:1, 4, 7</w:t>
-        </w:r>
-      </w:hyperlink>
-      <w:r>
-        <w:rPr>
-          <w:lang w:val="en_US" w:bidi="en_US"/>
-        </w:rPr>
-        <w:t xml:space="preserve">; </w:t>
-      </w:r>
-      <w:hyperlink r:id="rId96">
-        <w:r>
-          <w:rPr>
-            <w:lang w:val="en_US" w:bidi="en_US"/>
-          </w:rPr>
-          <w:rPr>
-            <w:color w:val="0000EE"/>
-            <w:u w:val="single"/>
-          </w:rPr>
-          <w:t>10:19</w:t>
-        </w:r>
-      </w:hyperlink>
-      <w:r>
-        <w:rPr>
-          <w:lang w:val="en_US" w:bidi="en_US"/>
-        </w:rPr>
-        <w:t xml:space="preserve">. The kind of idolatry that Paul condemns is that which involved Christians offering sacrifices to idols and then partaking of the food that had been sacrificed to them. The participants are called idol worshipers because their involvement in idolatrous sacrifices was perceived as having fellowship with demons. Paul strictly prohibited the eating of sacrificial food at the popular temples in the presence of idol-demons. As such, he shared the same view about idols as most Jews in his day. For the Jews, idols and heathen deities were identical. (See </w:t>
-      </w:r>
-      <w:hyperlink r:id="rId99">
-        <w:r>
-          <w:rPr>
-            <w:lang w:val="en_US" w:bidi="en_US"/>
-          </w:rPr>
-          <w:rPr>
-            <w:color w:val="0000EE"/>
-            <w:u w:val="single"/>
-          </w:rPr>
-          <w:t>1 Thes 1:9</w:t>
-        </w:r>
-      </w:hyperlink>
-      <w:r>
-        <w:rPr>
-          <w:lang w:val="en_US" w:bidi="en_US"/>
-        </w:rPr>
-        <w:t xml:space="preserve">, where Paul contrasts “idols” with “the living and </w:t>
-      </w:r>
-      <w:r>
-        <w:rPr>
-          <w:i/>
-          <w:lang w:val="en_US" w:bidi="en_US"/>
-        </w:rPr>
-        <w:t>true</w:t>
-      </w:r>
-      <w:r>
-        <w:rPr>
-          <w:lang w:val="en_US" w:bidi="en_US"/>
-        </w:rPr>
-        <w:t xml:space="preserve"> God.”) To Paul, idols in and of themselves were nothing (</w:t>
-      </w:r>
-      <w:hyperlink r:id="rId95">
-        <w:r>
-          <w:rPr>
-            <w:lang w:val="en_US" w:bidi="en_US"/>
-          </w:rPr>
-          <w:rPr>
-            <w:color w:val="0000EE"/>
-            <w:u w:val="single"/>
-          </w:rPr>
-          <w:t>1 Cor 8:4</w:t>
-        </w:r>
-      </w:hyperlink>
-      <w:r>
-        <w:rPr>
-          <w:lang w:val="en_US" w:bidi="en_US"/>
-        </w:rPr>
-        <w:t>); behind the idol, however, was a demon (</w:t>
-      </w:r>
-      <w:hyperlink r:id="rId100">
-        <w:r>
-          <w:rPr>
-            <w:lang w:val="en_US" w:bidi="en_US"/>
-          </w:rPr>
-          <w:rPr>
-            <w:color w:val="0000EE"/>
-            <w:u w:val="single"/>
-          </w:rPr>
-          <w:t>10:20</w:t>
-        </w:r>
-      </w:hyperlink>
-      <w:r>
-        <w:rPr>
-          <w:lang w:val="en_US" w:bidi="en_US"/>
-        </w:rPr>
-        <w:t>).</w:t>
-      </w:r>
-    </w:p>
-    <w:p>
-      <w:pPr/>
-      <w:r>
-        <w:rPr>
-          <w:lang w:val="en_US" w:bidi="en_US"/>
-        </w:rPr>
-      </w:r>
-      <w:r>
-        <w:rPr>
-          <w:lang w:val="en_US" w:bidi="en_US"/>
-        </w:rPr>
-        <w:t xml:space="preserve">The eating of sacrificial food at the cultic meals in pagan temples was censured by Paul because it was understood that the participants thereby became united to demons (see </w:t>
-      </w:r>
-      <w:hyperlink r:id="rId101">
-        <w:r>
-          <w:rPr>
-            <w:lang w:val="en_US" w:bidi="en_US"/>
-          </w:rPr>
-          <w:rPr>
-            <w:color w:val="0000EE"/>
-            <w:u w:val="single"/>
-          </w:rPr>
-          <w:t>1 Cor 10:19–21</w:t>
-        </w:r>
-      </w:hyperlink>
-      <w:r>
-        <w:rPr>
-          <w:lang w:val="en_US" w:bidi="en_US"/>
-        </w:rPr>
-        <w:t>). However, Paul had no problem with those who purchased food that had been left over from these events and that was later sold in the marketplace. In his judgment, if they ate it at home, they were not participating in idolatry. They could eat this food with a good conscience—unless, of course, in doing so they would be the means of destroying a weaker believer. For the sake of such believers, one should abstain. This was a matter of conscience (</w:t>
-      </w:r>
-      <w:hyperlink r:id="rId102">
-        <w:r>
-          <w:rPr>
-            <w:lang w:val="en_US" w:bidi="en_US"/>
-          </w:rPr>
-          <w:rPr>
-            <w:color w:val="0000EE"/>
-            <w:u w:val="single"/>
-          </w:rPr>
-          <w:t>10:25–29</w:t>
-        </w:r>
-      </w:hyperlink>
-      <w:r>
-        <w:rPr>
-          <w:lang w:val="en_US" w:bidi="en_US"/>
-        </w:rPr>
-        <w:t>). But going to pagan festivities and eating meals offered to idols was not permitted in any form.</w:t>
-      </w:r>
-    </w:p>
-    <w:p>
-      <w:pPr/>
-      <w:r>
-        <w:rPr>
-          <w:lang w:val="en_US" w:bidi="en_US"/>
-        </w:rPr>
-      </w:r>
-      <w:r>
-        <w:rPr>
-          <w:lang w:val="en_US" w:bidi="en_US"/>
-        </w:rPr>
-        <w:t xml:space="preserve">The Corinthians had participated in these meals regularly before they became Christians and apparently had continued to do so after their conversion. In Corinth such meals were the regular practice both at national festivals and private celebrations. The “gods” (whom Paul considered “demons”) were thought to be present at these events because the sacrifices were made to them. Thus, to participate in these events was to join oneself to demons and thereby become an idol worshiper. The ancient Israelites had been carried away into idolatry by their pagan neighbors on several occasions when they were enticed to participate in these pagan celebrations (e.g., </w:t>
-      </w:r>
-      <w:hyperlink r:id="rId103">
-        <w:r>
-          <w:rPr>
-            <w:lang w:val="en_US" w:bidi="en_US"/>
-          </w:rPr>
-          <w:rPr>
-            <w:color w:val="0000EE"/>
-            <w:u w:val="single"/>
-          </w:rPr>
-          <w:t>Nm 25</w:t>
-        </w:r>
-      </w:hyperlink>
-      <w:r>
-        <w:rPr>
-          <w:lang w:val="en_US" w:bidi="en_US"/>
-        </w:rPr>
-        <w:t xml:space="preserve">; cf. </w:t>
-      </w:r>
-      <w:hyperlink r:id="rId104">
-        <w:r>
-          <w:rPr>
-            <w:lang w:val="en_US" w:bidi="en_US"/>
-          </w:rPr>
-          <w:rPr>
-            <w:color w:val="0000EE"/>
-            <w:u w:val="single"/>
-          </w:rPr>
-          <w:t>Ex 32:6</w:t>
-        </w:r>
-      </w:hyperlink>
-      <w:r>
-        <w:rPr>
-          <w:lang w:val="en_US" w:bidi="en_US"/>
-        </w:rPr>
-        <w:t xml:space="preserve">). The festivities involved all sorts of licentiousness. In </w:t>
-      </w:r>
-      <w:hyperlink r:id="rId105">
-        <w:r>
-          <w:rPr>
-            <w:lang w:val="en_US" w:bidi="en_US"/>
-          </w:rPr>
-          <w:rPr>
-            <w:color w:val="0000EE"/>
-            <w:u w:val="single"/>
-          </w:rPr>
-          <w:t>1 Corinthians 10</w:t>
-        </w:r>
-      </w:hyperlink>
-      <w:r>
-        <w:rPr>
-          <w:lang w:val="en_US" w:bidi="en_US"/>
-        </w:rPr>
-        <w:t>, Paul referred to this apostasy of the Israelites and used it as a negative example. Because the Israelites became involved in pagan festivities, they were carried away into idolatry and fornication, which incited God’s wrath and brought destruction.</w:t>
-      </w:r>
-    </w:p>
-    <w:p>
-      <w:pPr/>
-      <w:r>
-        <w:rPr>
-          <w:lang w:val="en_US" w:bidi="en_US"/>
-        </w:rPr>
-      </w:r>
-      <w:r>
-        <w:rPr>
-          <w:lang w:val="en_US" w:bidi="en_US"/>
-        </w:rPr>
-        <w:t>In other Pauline Epistles, idolatry is mentioned but not with the kind of definition and extended discussion that is found in 1 Corinthians. Nonetheless, Paul speaks out against actual idolatry and what we might call figurative idolatry (i.e., idolatry in the sense of desiring something above God).</w:t>
-      </w:r>
-    </w:p>
-    <w:p>
-      <w:pPr/>
-      <w:r>
-        <w:rPr>
-          <w:lang w:val="en_US" w:bidi="en_US"/>
-        </w:rPr>
-      </w:r>
-      <w:r>
-        <w:rPr>
-          <w:lang w:val="en_US" w:bidi="en_US"/>
-        </w:rPr>
-        <w:t xml:space="preserve">In </w:t>
-      </w:r>
-      <w:hyperlink r:id="rId106">
-        <w:r>
-          <w:rPr>
-            <w:lang w:val="en_US" w:bidi="en_US"/>
-          </w:rPr>
-          <w:rPr>
-            <w:color w:val="0000EE"/>
-            <w:u w:val="single"/>
-          </w:rPr>
-          <w:t>Romans 1:18–32</w:t>
-        </w:r>
-      </w:hyperlink>
-      <w:r>
-        <w:rPr>
-          <w:lang w:val="en_US" w:bidi="en_US"/>
-        </w:rPr>
-        <w:t xml:space="preserve"> sexual licentiousness and other sins are ultimately traced to idolatry. The Gentiles, who should have known that God existed, as evidenced in creation and conscience, abandoned the immortal, invisible God in exchange for mortal, visible images (i.e., idols). Because of this abandonment, God gave them over to do the filthy things their hearts desired (</w:t>
-      </w:r>
-      <w:hyperlink r:id="rId107">
-        <w:r>
-          <w:rPr>
-            <w:lang w:val="en_US" w:bidi="en_US"/>
-          </w:rPr>
-          <w:rPr>
-            <w:color w:val="0000EE"/>
-            <w:u w:val="single"/>
-          </w:rPr>
-          <w:t>Rom 1:24</w:t>
-        </w:r>
-      </w:hyperlink>
-      <w:r>
-        <w:rPr>
-          <w:lang w:val="en_US" w:bidi="en_US"/>
-        </w:rPr>
-        <w:t xml:space="preserve">). Thus, idolatry is included in Paul’s list of what he calls “the works of the flesh” (see </w:t>
-      </w:r>
-      <w:hyperlink r:id="rId108">
-        <w:r>
-          <w:rPr>
-            <w:lang w:val="en_US" w:bidi="en_US"/>
-          </w:rPr>
-          <w:rPr>
-            <w:color w:val="0000EE"/>
-            <w:u w:val="single"/>
-          </w:rPr>
-          <w:t>Gal 5:19–20</w:t>
-        </w:r>
-      </w:hyperlink>
-      <w:r>
-        <w:rPr>
-          <w:lang w:val="en_US" w:bidi="en_US"/>
-        </w:rPr>
-        <w:t xml:space="preserve">). And those who are idol worshipers are included in the catalog of all those evil people who will not inherit the kingdom of God (see </w:t>
-      </w:r>
-      <w:hyperlink r:id="rId109">
-        <w:r>
-          <w:rPr>
-            <w:lang w:val="en_US" w:bidi="en_US"/>
-          </w:rPr>
-          <w:rPr>
-            <w:color w:val="0000EE"/>
-            <w:u w:val="single"/>
-          </w:rPr>
-          <w:t>1 Cor 6:9</w:t>
-        </w:r>
-      </w:hyperlink>
-      <w:r>
-        <w:rPr>
-          <w:lang w:val="en_US" w:bidi="en_US"/>
-        </w:rPr>
-        <w:t>).</w:t>
-      </w:r>
-    </w:p>
-    <w:p>
-      <w:pPr/>
-      <w:r>
-        <w:rPr>
-          <w:lang w:val="en_US" w:bidi="en_US"/>
-        </w:rPr>
-      </w:r>
-      <w:r>
-        <w:rPr>
-          <w:lang w:val="en_US" w:bidi="en_US"/>
-        </w:rPr>
-        <w:t xml:space="preserve">In </w:t>
-      </w:r>
-      <w:hyperlink r:id="rId110">
-        <w:r>
-          <w:rPr>
-            <w:lang w:val="en_US" w:bidi="en_US"/>
-          </w:rPr>
-          <w:rPr>
-            <w:color w:val="0000EE"/>
-            <w:u w:val="single"/>
-          </w:rPr>
-          <w:t>Ephesians 5:5</w:t>
-        </w:r>
-      </w:hyperlink>
-      <w:r>
-        <w:rPr>
-          <w:lang w:val="en_US" w:bidi="en_US"/>
-        </w:rPr>
-        <w:t xml:space="preserve"> Paul again includes idolaters among those who will not inherit the kingdom of God. However, such idolaters are not just those who go to pagan temples and worship idols; they are those who are greedy or covetous. According to superior manuscript evidence, the verse reads, “No fornicator or impure person or greedy person, which is the same as an idolater, has any inheritance in the kingdom of Christ and of God.” The point seems to be that the greedy, covetous person who makes his desires his god is much the same as an idolater. Thus, covetousness and idolatry are made synonymous. The parallel passage, </w:t>
-      </w:r>
-      <w:hyperlink r:id="rId111">
-        <w:r>
-          <w:rPr>
-            <w:lang w:val="en_US" w:bidi="en_US"/>
-          </w:rPr>
-          <w:rPr>
-            <w:color w:val="0000EE"/>
-            <w:u w:val="single"/>
-          </w:rPr>
-          <w:t>Colossians 3:5</w:t>
-        </w:r>
-      </w:hyperlink>
-      <w:r>
-        <w:rPr>
-          <w:lang w:val="en_US" w:bidi="en_US"/>
-        </w:rPr>
-        <w:t>, makes this explicit, which literally says covetousness is idolatry.</w:t>
-      </w:r>
-    </w:p>
-    <w:p>
-      <w:pPr/>
-      <w:r>
-        <w:rPr>
-          <w:lang w:val="en_US" w:bidi="en_US"/>
-        </w:rPr>
-      </w:r>
-      <w:r>
-        <w:rPr>
-          <w:i/>
-          <w:lang w:val="en_US" w:bidi="en_US"/>
-        </w:rPr>
         <w:t>See also</w:t>
       </w:r>
       <w:r>
@@ -3600,7 +4085,7 @@
         <w:rPr>
           <w:lang w:val="en_US" w:bidi="en_US"/>
         </w:rPr>
-        <w:t>Canaanite Deities and Religion</w:t>
+        <w:t>Canaanite Gods and Religion</w:t>
       </w:r>
       <w:r>
         <w:rPr>
@@ -19617,7 +20102,7 @@
         <w:rPr>
           <w:lang w:val="en_US" w:bidi="en_US"/>
         </w:rPr>
-        <w:t xml:space="preserve">). James and Jude, Jesus' brothers, became believers after they saw the risen Christ (for James—see </w:t>
+        <w:t xml:space="preserve">). James and Jude, Jesus' brothers, became believers after they saw the risen Christ (for James, see </w:t>
       </w:r>
       <w:hyperlink r:id="rId535">
         <w:r>
@@ -19635,7 +20120,7 @@
         <w:rPr>
           <w:lang w:val="en_US" w:bidi="en_US"/>
         </w:rPr>
-        <w:t xml:space="preserve">; for Jude—see </w:t>
+        <w:t xml:space="preserve">; for Jude, see </w:t>
       </w:r>
       <w:hyperlink r:id="rId536">
         <w:r>
@@ -19729,7 +20214,7 @@
         <w:rPr>
           <w:lang w:val="en_US" w:bidi="en_US"/>
         </w:rPr>
-        <w:t>). What they wrote was Spirit-taught. For example, when John wrote about Jesus giving eternal life, the Holy Spirit helped him express this truth in many different ways:</w:t>
+        <w:t>). What they wrote was Spirit-taught. For example, when John wrote about Jesus giving eternal life, the Holy Spirit helped him express this truth in many different ways, such as:</w:t>
       </w:r>
     </w:p>
     <w:p>
@@ -19761,6 +20246,12 @@
           <w:t>John 1:4)</w:t>
         </w:r>
       </w:hyperlink>
+      <w:r>
+        <w:rPr>
+          <w:lang w:val="en_US" w:bidi="en_US"/>
+        </w:rPr>
+        <w:t>;</w:t>
+      </w:r>
     </w:p>
     <w:p>
       <w:pPr>
@@ -19803,6 +20294,12 @@
           <w:t>(John 4:14)</w:t>
         </w:r>
       </w:hyperlink>
+      <w:r>
+        <w:rPr>
+          <w:lang w:val="en_US" w:bidi="en_US"/>
+        </w:rPr>
+        <w:t>;</w:t>
+      </w:r>
     </w:p>
     <w:p>
       <w:pPr>
@@ -19833,6 +20330,12 @@
           <w:t>(John 6:48)</w:t>
         </w:r>
       </w:hyperlink>
+      <w:r>
+        <w:rPr>
+          <w:lang w:val="en_US" w:bidi="en_US"/>
+        </w:rPr>
+        <w:t>;</w:t>
+      </w:r>
     </w:p>
     <w:p>
       <w:pPr>
@@ -19863,6 +20366,12 @@
           <w:t>John 8:12)</w:t>
         </w:r>
       </w:hyperlink>
+      <w:r>
+        <w:rPr>
+          <w:lang w:val="en_US" w:bidi="en_US"/>
+        </w:rPr>
+        <w:t>;</w:t>
+      </w:r>
     </w:p>
     <w:p>
       <w:pPr>
@@ -19905,6 +20414,12 @@
           <w:t>)</w:t>
         </w:r>
       </w:hyperlink>
+      <w:r>
+        <w:rPr>
+          <w:lang w:val="en_US" w:bidi="en_US"/>
+        </w:rPr>
+        <w:t>; and</w:t>
+      </w:r>
     </w:p>
     <w:p>
       <w:pPr>
@@ -19921,7 +20436,7 @@
         <w:rPr>
           <w:lang w:val="en_US" w:bidi="en_US"/>
         </w:rPr>
-        <w:t>and more (</w:t>
+        <w:t>“the way and the truth and the life” (</w:t>
       </w:r>
       <w:hyperlink r:id="rId543">
         <w:r>
@@ -19939,7 +20454,7 @@
         <w:rPr>
           <w:lang w:val="en_US" w:bidi="en_US"/>
         </w:rPr>
-        <w:t>)</w:t>
+        <w:t>).</w:t>
       </w:r>
     </w:p>
     <w:p>
@@ -19997,6 +20512,12 @@
           <w:t>(Colossians 2:3)</w:t>
         </w:r>
       </w:hyperlink>
+      <w:r>
+        <w:rPr>
+          <w:lang w:val="en_US" w:bidi="en_US"/>
+        </w:rPr>
+        <w:t>;</w:t>
+      </w:r>
     </w:p>
     <w:p>
       <w:pPr>
@@ -20027,6 +20548,12 @@
           <w:t>Colossians 2:9)</w:t>
         </w:r>
       </w:hyperlink>
+      <w:r>
+        <w:rPr>
+          <w:lang w:val="en_US" w:bidi="en_US"/>
+        </w:rPr>
+        <w:t>; and</w:t>
+      </w:r>
     </w:p>
     <w:p>
       <w:pPr>
@@ -20061,7 +20588,7 @@
         <w:rPr>
           <w:lang w:val="en_US" w:bidi="en_US"/>
         </w:rPr>
-        <w:t>)</w:t>
+        <w:t>).</w:t>
       </w:r>
     </w:p>
     <w:p>
@@ -20087,6 +20614,39 @@
           <w:lang w:val="en_US" w:bidi="en_US"/>
         </w:rPr>
         <w:t>The writers used their own words and styles to express the meaning given by the Holy Spirit. So, the Scriptures are a result of divine and human cooperation. The Scriptures were not mechanically inspired—God did not exclude the human experience to perfectly communicate the divine word. Rather, the Scriptures were inspired by God and then written by humans. The Bible, therefore, is both fully divine and fully human.</w:t>
+      </w:r>
+    </w:p>
+    <w:p>
+      <w:pPr/>
+      <w:r>
+        <w:rPr>
+          <w:lang w:val="en_US" w:bidi="en_US"/>
+        </w:rPr>
+      </w:r>
+      <w:r>
+        <w:rPr>
+          <w:i/>
+          <w:lang w:val="en_US" w:bidi="en_US"/>
+        </w:rPr>
+        <w:t>See also</w:t>
+      </w:r>
+      <w:r>
+        <w:rPr>
+          <w:lang w:val="en_US" w:bidi="en_US"/>
+        </w:rPr>
+        <w:t xml:space="preserve"> </w:t>
+      </w:r>
+      <w:r>
+        <w:rPr>
+          <w:lang w:val="en_US" w:bidi="en_US"/>
+        </w:rPr>
+        <w:t>Antilegomena (Disputed Christian Writings)</w:t>
+      </w:r>
+      <w:r>
+        <w:rPr>
+          <w:lang w:val="en_US" w:bidi="en_US"/>
+        </w:rPr>
+        <w:t>.</w:t>
       </w:r>
       <w:r>
         <w:rPr>

</xml_diff>